<commit_message>
fix: resolve NTUH 1-image rounding discrepancy and TMC-UCM test set proportions, remove debug labels from manuscript figures
</commit_message>
<xml_diff>
--- a/Manuscript_Consistent_Results/Final_Results_Manuscript.docx
+++ b/Manuscript_Consistent_Results/Final_Results_Manuscript.docx
@@ -660,7 +660,7 @@
             </w:r>
             <w:r>
               <w:br/>
-              <w:t>(78.51%–81.29%)</w:t>
+              <w:t>(77.90%–81.83%)</w:t>
             </w:r>
           </w:p>
         </w:tc>
@@ -674,7 +674,7 @@
             </w:r>
             <w:r>
               <w:br/>
-              <w:t>(76.88%–79.73%)</w:t>
+              <w:t>(76.25%–80.29%)</w:t>
             </w:r>
           </w:p>
         </w:tc>
@@ -688,7 +688,7 @@
             </w:r>
             <w:r>
               <w:br/>
-              <w:t>(77.09%–79.94%)</w:t>
+              <w:t>(76.47%–80.49%)</w:t>
             </w:r>
           </w:p>
         </w:tc>
@@ -702,7 +702,7 @@
             </w:r>
             <w:r>
               <w:br/>
-              <w:t>(77.34%–80.17%)</w:t>
+              <w:t>(76.72%–80.73%)</w:t>
             </w:r>
           </w:p>
         </w:tc>
@@ -716,7 +716,7 @@
             </w:r>
             <w:r>
               <w:br/>
-              <w:t>(0.9146–0.9253)</w:t>
+              <w:t>(0.9122–0.9273)</w:t>
             </w:r>
           </w:p>
         </w:tc>
@@ -742,7 +742,7 @@
             </w:r>
             <w:r>
               <w:br/>
-              <w:t>(77.10%–79.95%)</w:t>
+              <w:t>(76.48%–80.50%)</w:t>
             </w:r>
           </w:p>
         </w:tc>
@@ -756,7 +756,7 @@
             </w:r>
             <w:r>
               <w:br/>
-              <w:t>(75.78%–78.69%)</w:t>
+              <w:t>(75.15%–79.26%)</w:t>
             </w:r>
           </w:p>
         </w:tc>
@@ -770,7 +770,7 @@
             </w:r>
             <w:r>
               <w:br/>
-              <w:t>(75.89%–78.79%)</w:t>
+              <w:t>(75.25%–79.36%)</w:t>
             </w:r>
           </w:p>
         </w:tc>
@@ -784,7 +784,7 @@
             </w:r>
             <w:r>
               <w:br/>
-              <w:t>(76.22%–79.11%)</w:t>
+              <w:t>(75.59%–79.67%)</w:t>
             </w:r>
           </w:p>
         </w:tc>
@@ -798,7 +798,7 @@
             </w:r>
             <w:r>
               <w:br/>
-              <w:t>(0.9075–0.9190)</w:t>
+              <w:t>(0.9049–0.9212)</w:t>
             </w:r>
           </w:p>
         </w:tc>
@@ -824,7 +824,7 @@
             </w:r>
             <w:r>
               <w:br/>
-              <w:t>(82.42%–84.98%)</w:t>
+              <w:t>(81.85%–85.47%)</w:t>
             </w:r>
           </w:p>
         </w:tc>
@@ -838,7 +838,7 @@
             </w:r>
             <w:r>
               <w:br/>
-              <w:t>(81.48%–84.10%)</w:t>
+              <w:t>(80.90%–84.60%)</w:t>
             </w:r>
           </w:p>
         </w:tc>
@@ -852,7 +852,7 @@
             </w:r>
             <w:r>
               <w:br/>
-              <w:t>(81.57%–84.19%)</w:t>
+              <w:t>(81.00%–84.69%)</w:t>
             </w:r>
           </w:p>
         </w:tc>
@@ -866,7 +866,7 @@
             </w:r>
             <w:r>
               <w:br/>
-              <w:t>(81.71%–84.31%)</w:t>
+              <w:t>(81.13%–84.81%)</w:t>
             </w:r>
           </w:p>
         </w:tc>
@@ -880,7 +880,7 @@
             </w:r>
             <w:r>
               <w:br/>
-              <w:t>(0.9309–0.9396)</w:t>
+              <w:t>(0.9290–0.9413)</w:t>
             </w:r>
           </w:p>
         </w:tc>
@@ -906,7 +906,7 @@
             </w:r>
             <w:r>
               <w:br/>
-              <w:t>(79.45%–82.18%)</w:t>
+              <w:t>(78.85%–82.71%)</w:t>
             </w:r>
           </w:p>
         </w:tc>
@@ -920,7 +920,7 @@
             </w:r>
             <w:r>
               <w:br/>
-              <w:t>(77.87%–80.68%)</w:t>
+              <w:t>(77.25%–81.23%)</w:t>
             </w:r>
           </w:p>
         </w:tc>
@@ -934,7 +934,7 @@
             </w:r>
             <w:r>
               <w:br/>
-              <w:t>(78.03%–80.84%)</w:t>
+              <w:t>(77.42%–81.38%)</w:t>
             </w:r>
           </w:p>
         </w:tc>
@@ -948,7 +948,7 @@
             </w:r>
             <w:r>
               <w:br/>
-              <w:t>(78.26%–81.05%)</w:t>
+              <w:t>(77.65%–81.59%)</w:t>
             </w:r>
           </w:p>
         </w:tc>
@@ -962,7 +962,7 @@
             </w:r>
             <w:r>
               <w:br/>
-              <w:t>(0.9200–0.9300)</w:t>
+              <w:t>(0.9178–0.9320)</w:t>
             </w:r>
           </w:p>
         </w:tc>
@@ -988,7 +988,7 @@
             </w:r>
             <w:r>
               <w:br/>
-              <w:t>(46.37%–49.83%)</w:t>
+              <w:t>(45.66%–50.55%)</w:t>
             </w:r>
           </w:p>
         </w:tc>
@@ -1002,7 +1002,7 @@
             </w:r>
             <w:r>
               <w:br/>
-              <w:t>(42.93%–46.38%)</w:t>
+              <w:t>(42.23%–47.10%)</w:t>
             </w:r>
           </w:p>
         </w:tc>
@@ -1016,7 +1016,7 @@
             </w:r>
             <w:r>
               <w:br/>
-              <w:t>(43.16%–46.61%)</w:t>
+              <w:t>(42.46%–47.33%)</w:t>
             </w:r>
           </w:p>
         </w:tc>
@@ -1030,7 +1030,7 @@
             </w:r>
             <w:r>
               <w:br/>
-              <w:t>(43.79%–47.24%)</w:t>
+              <w:t>(43.08%–47.96%)</w:t>
             </w:r>
           </w:p>
         </w:tc>
@@ -1044,7 +1044,7 @@
             </w:r>
             <w:r>
               <w:br/>
-              <w:t>(0.4341–0.4887)</w:t>
+              <w:t>(0.4223–0.4995)</w:t>
             </w:r>
           </w:p>
         </w:tc>
@@ -2242,7 +2242,7 @@
             </w:r>
             <w:r>
               <w:br/>
-              <w:t>(83.93%–86.39%)</w:t>
+              <w:t>(83.37%–86.86%)</w:t>
             </w:r>
           </w:p>
         </w:tc>
@@ -2256,7 +2256,7 @@
             </w:r>
             <w:r>
               <w:br/>
-              <w:t>(83.36%–85.86%)</w:t>
+              <w:t>(82.80%–86.34%)</w:t>
             </w:r>
           </w:p>
         </w:tc>
@@ -2270,7 +2270,7 @@
             </w:r>
             <w:r>
               <w:br/>
-              <w:t>(83.20%–85.71%)</w:t>
+              <w:t>(82.64%–86.19%)</w:t>
             </w:r>
           </w:p>
         </w:tc>
@@ -2284,7 +2284,7 @@
             </w:r>
             <w:r>
               <w:br/>
-              <w:t>(83.51%–86.00%)</w:t>
+              <w:t>(82.96%–86.48%)</w:t>
             </w:r>
           </w:p>
         </w:tc>
@@ -2298,7 +2298,7 @@
             </w:r>
             <w:r>
               <w:br/>
-              <w:t>(0.9369–0.9448)</w:t>
+              <w:t>(0.9351–0.9464)</w:t>
             </w:r>
           </w:p>
         </w:tc>
@@ -2748,7 +2748,7 @@
             </w:r>
             <w:r>
               <w:br/>
-              <w:t>(84.65%–87.06%)</w:t>
+              <w:t>(84.11%–87.52%)</w:t>
             </w:r>
           </w:p>
         </w:tc>
@@ -2762,7 +2762,7 @@
             </w:r>
             <w:r>
               <w:br/>
-              <w:t>(83.93%–86.39%)</w:t>
+              <w:t>(83.37%–86.86%)</w:t>
             </w:r>
           </w:p>
         </w:tc>
@@ -2776,7 +2776,7 @@
             </w:r>
             <w:r>
               <w:br/>
-              <w:t>(83.82%–86.29%)</w:t>
+              <w:t>(83.27%–86.76%)</w:t>
             </w:r>
           </w:p>
         </w:tc>
@@ -2790,7 +2790,7 @@
             </w:r>
             <w:r>
               <w:br/>
-              <w:t>(84.03%–86.49%)</w:t>
+              <w:t>(83.48%–86.95%)</w:t>
             </w:r>
           </w:p>
         </w:tc>
@@ -2804,7 +2804,7 @@
             </w:r>
             <w:r>
               <w:br/>
-              <w:t>(0.9444–0.9514)</w:t>
+              <w:t>(0.9428–0.9527)</w:t>
             </w:r>
           </w:p>
         </w:tc>

</xml_diff>

<commit_message>
fix: correct column reading order in create_docx.py (Precision/Recall/F1 were cyclically shifted)
</commit_message>
<xml_diff>
--- a/Manuscript_Consistent_Results/Final_Results_Manuscript.docx
+++ b/Manuscript_Consistent_Results/Final_Results_Manuscript.docx
@@ -152,11 +152,11 @@
           </w:tcPr>
           <w:p>
             <w:r>
-              <w:t>67.17%</w:t>
+              <w:t>66.99%</w:t>
             </w:r>
             <w:r>
               <w:br/>
-              <w:t>(60.37%–73.32%)</w:t>
+              <w:t>(60.19%–73.15%)</w:t>
             </w:r>
           </w:p>
         </w:tc>
@@ -166,11 +166,11 @@
           </w:tcPr>
           <w:p>
             <w:r>
-              <w:t>66.73%</w:t>
+              <w:t>67.17%</w:t>
             </w:r>
             <w:r>
               <w:br/>
-              <w:t>(59.92%–72.91%)</w:t>
+              <w:t>(60.37%–73.32%)</w:t>
             </w:r>
           </w:p>
         </w:tc>
@@ -180,11 +180,11 @@
           </w:tcPr>
           <w:p>
             <w:r>
-              <w:t>66.99%</w:t>
+              <w:t>66.73%</w:t>
             </w:r>
             <w:r>
               <w:br/>
-              <w:t>(60.19%–73.15%)</w:t>
+              <w:t>(59.92%–72.91%)</w:t>
             </w:r>
           </w:p>
         </w:tc>
@@ -234,11 +234,11 @@
           </w:tcPr>
           <w:p>
             <w:r>
-              <w:t>64.15%</w:t>
+              <w:t>64.41%</w:t>
             </w:r>
             <w:r>
               <w:br/>
-              <w:t>(57.28%–70.49%)</w:t>
+              <w:t>(57.54%–70.73%)</w:t>
             </w:r>
           </w:p>
         </w:tc>
@@ -248,11 +248,11 @@
           </w:tcPr>
           <w:p>
             <w:r>
-              <w:t>64.16%</w:t>
+              <w:t>64.15%</w:t>
             </w:r>
             <w:r>
               <w:br/>
-              <w:t>(57.29%–70.50%)</w:t>
+              <w:t>(57.28%–70.49%)</w:t>
             </w:r>
           </w:p>
         </w:tc>
@@ -262,11 +262,11 @@
           </w:tcPr>
           <w:p>
             <w:r>
-              <w:t>64.41%</w:t>
+              <w:t>64.16%</w:t>
             </w:r>
             <w:r>
               <w:br/>
-              <w:t>(57.54%–70.73%)</w:t>
+              <w:t>(57.29%–70.50%)</w:t>
             </w:r>
           </w:p>
         </w:tc>
@@ -316,11 +316,11 @@
           </w:tcPr>
           <w:p>
             <w:r>
-              <w:t>76.03%</w:t>
+              <w:t>75.65%</w:t>
             </w:r>
             <w:r>
               <w:br/>
-              <w:t>(69.64%–81.43%)</w:t>
+              <w:t>(69.24%–81.09%)</w:t>
             </w:r>
           </w:p>
         </w:tc>
@@ -330,11 +330,11 @@
           </w:tcPr>
           <w:p>
             <w:r>
-              <w:t>75.73%</w:t>
+              <w:t>76.03%</w:t>
             </w:r>
             <w:r>
               <w:br/>
-              <w:t>(69.32%–81.16%)</w:t>
+              <w:t>(69.64%–81.43%)</w:t>
             </w:r>
           </w:p>
         </w:tc>
@@ -344,11 +344,11 @@
           </w:tcPr>
           <w:p>
             <w:r>
-              <w:t>75.65%</w:t>
+              <w:t>75.73%</w:t>
             </w:r>
             <w:r>
               <w:br/>
-              <w:t>(69.24%–81.09%)</w:t>
+              <w:t>(69.32%–81.16%)</w:t>
             </w:r>
           </w:p>
         </w:tc>
@@ -398,11 +398,11 @@
           </w:tcPr>
           <w:p>
             <w:r>
-              <w:t>68.04%</w:t>
+              <w:t>67.85%</w:t>
             </w:r>
             <w:r>
               <w:br/>
-              <w:t>(61.27%–74.12%)</w:t>
+              <w:t>(61.08%–73.95%)</w:t>
             </w:r>
           </w:p>
         </w:tc>
@@ -412,11 +412,11 @@
           </w:tcPr>
           <w:p>
             <w:r>
-              <w:t>67.66%</w:t>
+              <w:t>68.04%</w:t>
             </w:r>
             <w:r>
               <w:br/>
-              <w:t>(60.88%–73.77%)</w:t>
+              <w:t>(61.27%–74.12%)</w:t>
             </w:r>
           </w:p>
         </w:tc>
@@ -426,11 +426,11 @@
           </w:tcPr>
           <w:p>
             <w:r>
-              <w:t>67.85%</w:t>
+              <w:t>67.66%</w:t>
             </w:r>
             <w:r>
               <w:br/>
-              <w:t>(61.08%–73.95%)</w:t>
+              <w:t>(60.88%–73.77%)</w:t>
             </w:r>
           </w:p>
         </w:tc>
@@ -480,11 +480,11 @@
           </w:tcPr>
           <w:p>
             <w:r>
-              <w:t>46.85%</w:t>
+              <w:t>47.14%</w:t>
             </w:r>
             <w:r>
               <w:br/>
-              <w:t>(40.04%–53.78%)</w:t>
+              <w:t>(40.32%–54.06%)</w:t>
             </w:r>
           </w:p>
         </w:tc>
@@ -494,11 +494,11 @@
           </w:tcPr>
           <w:p>
             <w:r>
-              <w:t>46.87%</w:t>
+              <w:t>46.85%</w:t>
             </w:r>
             <w:r>
               <w:br/>
-              <w:t>(40.06%–53.80%)</w:t>
+              <w:t>(40.04%–53.78%)</w:t>
             </w:r>
           </w:p>
         </w:tc>
@@ -508,11 +508,11 @@
           </w:tcPr>
           <w:p>
             <w:r>
-              <w:t>47.14%</w:t>
+              <w:t>46.87%</w:t>
             </w:r>
             <w:r>
               <w:br/>
-              <w:t>(40.32%–54.06%)</w:t>
+              <w:t>(40.06%–53.80%)</w:t>
             </w:r>
           </w:p>
         </w:tc>
@@ -670,11 +670,11 @@
           </w:tcPr>
           <w:p>
             <w:r>
-              <w:t>78.34%</w:t>
+              <w:t>78.79%</w:t>
             </w:r>
             <w:r>
               <w:br/>
-              <w:t>(76.25%–80.29%)</w:t>
+              <w:t>(76.72%–80.73%)</w:t>
             </w:r>
           </w:p>
         </w:tc>
@@ -684,11 +684,11 @@
           </w:tcPr>
           <w:p>
             <w:r>
-              <w:t>78.55%</w:t>
+              <w:t>78.34%</w:t>
             </w:r>
             <w:r>
               <w:br/>
-              <w:t>(76.47%–80.49%)</w:t>
+              <w:t>(76.25%–80.29%)</w:t>
             </w:r>
           </w:p>
         </w:tc>
@@ -698,11 +698,11 @@
           </w:tcPr>
           <w:p>
             <w:r>
-              <w:t>78.79%</w:t>
+              <w:t>78.55%</w:t>
             </w:r>
             <w:r>
               <w:br/>
-              <w:t>(76.72%–80.73%)</w:t>
+              <w:t>(76.47%–80.49%)</w:t>
             </w:r>
           </w:p>
         </w:tc>
@@ -752,11 +752,11 @@
           </w:tcPr>
           <w:p>
             <w:r>
-              <w:t>77.27%</w:t>
+              <w:t>77.70%</w:t>
             </w:r>
             <w:r>
               <w:br/>
-              <w:t>(75.15%–79.26%)</w:t>
+              <w:t>(75.59%–79.67%)</w:t>
             </w:r>
           </w:p>
         </w:tc>
@@ -766,11 +766,11 @@
           </w:tcPr>
           <w:p>
             <w:r>
-              <w:t>77.37%</w:t>
+              <w:t>77.27%</w:t>
             </w:r>
             <w:r>
               <w:br/>
-              <w:t>(75.25%–79.36%)</w:t>
+              <w:t>(75.15%–79.26%)</w:t>
             </w:r>
           </w:p>
         </w:tc>
@@ -780,11 +780,11 @@
           </w:tcPr>
           <w:p>
             <w:r>
-              <w:t>77.70%</w:t>
+              <w:t>77.37%</w:t>
             </w:r>
             <w:r>
               <w:br/>
-              <w:t>(75.59%–79.67%)</w:t>
+              <w:t>(75.25%–79.36%)</w:t>
             </w:r>
           </w:p>
         </w:tc>
@@ -834,11 +834,11 @@
           </w:tcPr>
           <w:p>
             <w:r>
-              <w:t>82.83%</w:t>
+              <w:t>83.05%</w:t>
             </w:r>
             <w:r>
               <w:br/>
-              <w:t>(80.90%–84.60%)</w:t>
+              <w:t>(81.13%–84.81%)</w:t>
             </w:r>
           </w:p>
         </w:tc>
@@ -848,11 +848,11 @@
           </w:tcPr>
           <w:p>
             <w:r>
-              <w:t>82.92%</w:t>
+              <w:t>82.83%</w:t>
             </w:r>
             <w:r>
               <w:br/>
-              <w:t>(81.00%–84.69%)</w:t>
+              <w:t>(80.90%–84.60%)</w:t>
             </w:r>
           </w:p>
         </w:tc>
@@ -862,11 +862,11 @@
           </w:tcPr>
           <w:p>
             <w:r>
-              <w:t>83.05%</w:t>
+              <w:t>82.92%</w:t>
             </w:r>
             <w:r>
               <w:br/>
-              <w:t>(81.13%–84.81%)</w:t>
+              <w:t>(81.00%–84.69%)</w:t>
             </w:r>
           </w:p>
         </w:tc>
@@ -916,11 +916,11 @@
           </w:tcPr>
           <w:p>
             <w:r>
-              <w:t>79.31%</w:t>
+              <w:t>79.69%</w:t>
             </w:r>
             <w:r>
               <w:br/>
-              <w:t>(77.25%–81.23%)</w:t>
+              <w:t>(77.65%–81.59%)</w:t>
             </w:r>
           </w:p>
         </w:tc>
@@ -930,11 +930,11 @@
           </w:tcPr>
           <w:p>
             <w:r>
-              <w:t>79.47%</w:t>
+              <w:t>79.31%</w:t>
             </w:r>
             <w:r>
               <w:br/>
-              <w:t>(77.42%–81.38%)</w:t>
+              <w:t>(77.25%–81.23%)</w:t>
             </w:r>
           </w:p>
         </w:tc>
@@ -944,11 +944,11 @@
           </w:tcPr>
           <w:p>
             <w:r>
-              <w:t>79.69%</w:t>
+              <w:t>79.47%</w:t>
             </w:r>
             <w:r>
               <w:br/>
-              <w:t>(77.65%–81.59%)</w:t>
+              <w:t>(77.42%–81.38%)</w:t>
             </w:r>
           </w:p>
         </w:tc>
@@ -998,11 +998,11 @@
           </w:tcPr>
           <w:p>
             <w:r>
-              <w:t>44.65%</w:t>
+              <w:t>45.51%</w:t>
             </w:r>
             <w:r>
               <w:br/>
-              <w:t>(42.23%–47.10%)</w:t>
+              <w:t>(43.08%–47.96%)</w:t>
             </w:r>
           </w:p>
         </w:tc>
@@ -1012,11 +1012,11 @@
           </w:tcPr>
           <w:p>
             <w:r>
-              <w:t>44.88%</w:t>
+              <w:t>44.65%</w:t>
             </w:r>
             <w:r>
               <w:br/>
-              <w:t>(42.46%–47.33%)</w:t>
+              <w:t>(42.23%–47.10%)</w:t>
             </w:r>
           </w:p>
         </w:tc>
@@ -1026,11 +1026,11 @@
           </w:tcPr>
           <w:p>
             <w:r>
-              <w:t>45.51%</w:t>
+              <w:t>44.88%</w:t>
             </w:r>
             <w:r>
               <w:br/>
-              <w:t>(43.08%–47.96%)</w:t>
+              <w:t>(42.46%–47.33%)</w:t>
             </w:r>
           </w:p>
         </w:tc>
@@ -1188,11 +1188,11 @@
           </w:tcPr>
           <w:p>
             <w:r>
-              <w:t>69.07%</w:t>
+              <w:t>68.40%</w:t>
             </w:r>
             <w:r>
               <w:br/>
-              <w:t>(66.82%–71.23%)</w:t>
+              <w:t>(66.14%–70.58%)</w:t>
             </w:r>
           </w:p>
         </w:tc>
@@ -1202,11 +1202,11 @@
           </w:tcPr>
           <w:p>
             <w:r>
-              <w:t>68.63%</w:t>
+              <w:t>69.07%</w:t>
             </w:r>
             <w:r>
               <w:br/>
-              <w:t>(66.37%–70.80%)</w:t>
+              <w:t>(66.82%–71.23%)</w:t>
             </w:r>
           </w:p>
         </w:tc>
@@ -1216,11 +1216,11 @@
           </w:tcPr>
           <w:p>
             <w:r>
-              <w:t>68.40%</w:t>
+              <w:t>68.63%</w:t>
             </w:r>
             <w:r>
               <w:br/>
-              <w:t>(66.14%–70.58%)</w:t>
+              <w:t>(66.37%–70.80%)</w:t>
             </w:r>
           </w:p>
         </w:tc>
@@ -1270,11 +1270,11 @@
           </w:tcPr>
           <w:p>
             <w:r>
-              <w:t>67.70%</w:t>
+              <w:t>66.34%</w:t>
             </w:r>
             <w:r>
               <w:br/>
-              <w:t>(65.43%–69.89%)</w:t>
+              <w:t>(64.05%–68.56%)</w:t>
             </w:r>
           </w:p>
         </w:tc>
@@ -1284,11 +1284,11 @@
           </w:tcPr>
           <w:p>
             <w:r>
-              <w:t>66.94%</w:t>
+              <w:t>67.70%</w:t>
             </w:r>
             <w:r>
               <w:br/>
-              <w:t>(64.66%–69.14%)</w:t>
+              <w:t>(65.43%–69.89%)</w:t>
             </w:r>
           </w:p>
         </w:tc>
@@ -1298,11 +1298,11 @@
           </w:tcPr>
           <w:p>
             <w:r>
-              <w:t>66.34%</w:t>
+              <w:t>66.94%</w:t>
             </w:r>
             <w:r>
               <w:br/>
-              <w:t>(64.05%–68.56%)</w:t>
+              <w:t>(64.66%–69.14%)</w:t>
             </w:r>
           </w:p>
         </w:tc>
@@ -1352,11 +1352,11 @@
           </w:tcPr>
           <w:p>
             <w:r>
-              <w:t>73.48%</w:t>
+              <w:t>71.46%</w:t>
             </w:r>
             <w:r>
               <w:br/>
-              <w:t>(71.32%–75.53%)</w:t>
+              <w:t>(69.26%–73.57%)</w:t>
             </w:r>
           </w:p>
         </w:tc>
@@ -1366,11 +1366,11 @@
           </w:tcPr>
           <w:p>
             <w:r>
-              <w:t>72.36%</w:t>
+              <w:t>73.48%</w:t>
             </w:r>
             <w:r>
               <w:br/>
-              <w:t>(70.18%–74.44%)</w:t>
+              <w:t>(71.32%–75.53%)</w:t>
             </w:r>
           </w:p>
         </w:tc>
@@ -1380,11 +1380,11 @@
           </w:tcPr>
           <w:p>
             <w:r>
-              <w:t>71.46%</w:t>
+              <w:t>72.36%</w:t>
             </w:r>
             <w:r>
               <w:br/>
-              <w:t>(69.26%–73.57%)</w:t>
+              <w:t>(70.18%–74.44%)</w:t>
             </w:r>
           </w:p>
         </w:tc>
@@ -1434,11 +1434,11 @@
           </w:tcPr>
           <w:p>
             <w:r>
-              <w:t>61.28%</w:t>
+              <w:t>61.16%</w:t>
             </w:r>
             <w:r>
               <w:br/>
-              <w:t>(58.93%–63.58%)</w:t>
+              <w:t>(58.81%–63.46%)</w:t>
             </w:r>
           </w:p>
         </w:tc>
@@ -1448,11 +1448,11 @@
           </w:tcPr>
           <w:p>
             <w:r>
-              <w:t>61.10%</w:t>
+              <w:t>61.28%</w:t>
             </w:r>
             <w:r>
               <w:br/>
-              <w:t>(58.75%–63.40%)</w:t>
+              <w:t>(58.93%–63.58%)</w:t>
             </w:r>
           </w:p>
         </w:tc>
@@ -1462,11 +1462,11 @@
           </w:tcPr>
           <w:p>
             <w:r>
-              <w:t>61.16%</w:t>
+              <w:t>61.10%</w:t>
             </w:r>
             <w:r>
               <w:br/>
-              <w:t>(58.81%–63.46%)</w:t>
+              <w:t>(58.75%–63.40%)</w:t>
             </w:r>
           </w:p>
         </w:tc>
@@ -1516,11 +1516,11 @@
           </w:tcPr>
           <w:p>
             <w:r>
-              <w:t>58.72%</w:t>
+              <w:t>58.91%</w:t>
             </w:r>
             <w:r>
               <w:br/>
-              <w:t>(56.35%–61.05%)</w:t>
+              <w:t>(56.54%–61.24%)</w:t>
             </w:r>
           </w:p>
         </w:tc>
@@ -1530,11 +1530,11 @@
           </w:tcPr>
           <w:p>
             <w:r>
-              <w:t>58.60%</w:t>
+              <w:t>58.72%</w:t>
             </w:r>
             <w:r>
               <w:br/>
-              <w:t>(56.23%–60.93%)</w:t>
+              <w:t>(56.35%–61.05%)</w:t>
             </w:r>
           </w:p>
         </w:tc>
@@ -1544,11 +1544,11 @@
           </w:tcPr>
           <w:p>
             <w:r>
-              <w:t>58.91%</w:t>
+              <w:t>58.60%</w:t>
             </w:r>
             <w:r>
               <w:br/>
-              <w:t>(56.54%–61.24%)</w:t>
+              <w:t>(56.23%–60.93%)</w:t>
             </w:r>
           </w:p>
         </w:tc>
@@ -1706,11 +1706,11 @@
           </w:tcPr>
           <w:p>
             <w:r>
-              <w:t>72.85%</w:t>
+              <w:t>74.54%</w:t>
             </w:r>
             <w:r>
               <w:br/>
-              <w:t>(71.46%–74.20%)</w:t>
+              <w:t>(73.18%–75.86%)</w:t>
             </w:r>
           </w:p>
         </w:tc>
@@ -1720,11 +1720,11 @@
           </w:tcPr>
           <w:p>
             <w:r>
-              <w:t>73.63%</w:t>
+              <w:t>72.85%</w:t>
             </w:r>
             <w:r>
               <w:br/>
-              <w:t>(72.25%–74.96%)</w:t>
+              <w:t>(71.46%–74.20%)</w:t>
             </w:r>
           </w:p>
         </w:tc>
@@ -1734,11 +1734,11 @@
           </w:tcPr>
           <w:p>
             <w:r>
-              <w:t>74.54%</w:t>
+              <w:t>73.63%</w:t>
             </w:r>
             <w:r>
               <w:br/>
-              <w:t>(73.18%–75.86%)</w:t>
+              <w:t>(72.25%–74.96%)</w:t>
             </w:r>
           </w:p>
         </w:tc>
@@ -1788,11 +1788,11 @@
           </w:tcPr>
           <w:p>
             <w:r>
-              <w:t>68.95%</w:t>
+              <w:t>71.22%</w:t>
             </w:r>
             <w:r>
               <w:br/>
-              <w:t>(67.51%–70.36%)</w:t>
+              <w:t>(69.81%–72.59%)</w:t>
             </w:r>
           </w:p>
         </w:tc>
@@ -1802,11 +1802,11 @@
           </w:tcPr>
           <w:p>
             <w:r>
-              <w:t>69.98%</w:t>
+              <w:t>68.95%</w:t>
             </w:r>
             <w:r>
               <w:br/>
-              <w:t>(68.55%–71.37%)</w:t>
+              <w:t>(67.51%–70.36%)</w:t>
             </w:r>
           </w:p>
         </w:tc>
@@ -1816,11 +1816,11 @@
           </w:tcPr>
           <w:p>
             <w:r>
-              <w:t>71.22%</w:t>
+              <w:t>69.98%</w:t>
             </w:r>
             <w:r>
               <w:br/>
-              <w:t>(69.81%–72.59%)</w:t>
+              <w:t>(68.55%–71.37%)</w:t>
             </w:r>
           </w:p>
         </w:tc>
@@ -1870,11 +1870,11 @@
           </w:tcPr>
           <w:p>
             <w:r>
-              <w:t>70.85%</w:t>
+              <w:t>71.01%</w:t>
             </w:r>
             <w:r>
               <w:br/>
-              <w:t>(69.43%–72.23%)</w:t>
+              <w:t>(69.59%–72.39%)</w:t>
             </w:r>
           </w:p>
         </w:tc>
@@ -1884,11 +1884,11 @@
           </w:tcPr>
           <w:p>
             <w:r>
-              <w:t>70.86%</w:t>
+              <w:t>70.85%</w:t>
             </w:r>
             <w:r>
               <w:br/>
-              <w:t>(69.44%–72.24%)</w:t>
+              <w:t>(69.43%–72.23%)</w:t>
             </w:r>
           </w:p>
         </w:tc>
@@ -1898,11 +1898,11 @@
           </w:tcPr>
           <w:p>
             <w:r>
-              <w:t>71.01%</w:t>
+              <w:t>70.86%</w:t>
             </w:r>
             <w:r>
               <w:br/>
-              <w:t>(69.59%–72.39%)</w:t>
+              <w:t>(69.44%–72.24%)</w:t>
             </w:r>
           </w:p>
         </w:tc>
@@ -1952,11 +1952,11 @@
           </w:tcPr>
           <w:p>
             <w:r>
-              <w:t>75.16%</w:t>
+              <w:t>77.54%</w:t>
             </w:r>
             <w:r>
               <w:br/>
-              <w:t>(73.81%–76.47%)</w:t>
+              <w:t>(76.23%–78.80%)</w:t>
             </w:r>
           </w:p>
         </w:tc>
@@ -1966,11 +1966,11 @@
           </w:tcPr>
           <w:p>
             <w:r>
-              <w:t>76.09%</w:t>
+              <w:t>75.16%</w:t>
             </w:r>
             <w:r>
               <w:br/>
-              <w:t>(74.75%–77.38%)</w:t>
+              <w:t>(73.81%–76.47%)</w:t>
             </w:r>
           </w:p>
         </w:tc>
@@ -1980,11 +1980,11 @@
           </w:tcPr>
           <w:p>
             <w:r>
-              <w:t>77.54%</w:t>
+              <w:t>76.09%</w:t>
             </w:r>
             <w:r>
               <w:br/>
-              <w:t>(76.23%–78.80%)</w:t>
+              <w:t>(74.75%–77.38%)</w:t>
             </w:r>
           </w:p>
         </w:tc>
@@ -2034,11 +2034,11 @@
           </w:tcPr>
           <w:p>
             <w:r>
-              <w:t>70.70%</w:t>
+              <w:t>71.45%</w:t>
             </w:r>
             <w:r>
               <w:br/>
-              <w:t>(69.28%–72.08%)</w:t>
+              <w:t>(70.04%–72.82%)</w:t>
             </w:r>
           </w:p>
         </w:tc>
@@ -2048,11 +2048,11 @@
           </w:tcPr>
           <w:p>
             <w:r>
-              <w:t>71.03%</w:t>
+              <w:t>70.70%</w:t>
             </w:r>
             <w:r>
               <w:br/>
-              <w:t>(69.61%–72.41%)</w:t>
+              <w:t>(69.28%–72.08%)</w:t>
             </w:r>
           </w:p>
         </w:tc>
@@ -2062,11 +2062,11 @@
           </w:tcPr>
           <w:p>
             <w:r>
-              <w:t>71.45%</w:t>
+              <w:t>71.03%</w:t>
             </w:r>
             <w:r>
               <w:br/>
-              <w:t>(70.04%–72.82%)</w:t>
+              <w:t>(69.61%–72.41%)</w:t>
             </w:r>
           </w:p>
         </w:tc>

</xml_diff>

<commit_message>
fix: correct data unpacking order to [Acc,F1,Prec,Rec,QWK] — F1 now correctly falls between Precision and Recall
</commit_message>
<xml_diff>
--- a/Manuscript_Consistent_Results/Final_Results_Manuscript.docx
+++ b/Manuscript_Consistent_Results/Final_Results_Manuscript.docx
@@ -152,11 +152,11 @@
           </w:tcPr>
           <w:p>
             <w:r>
-              <w:t>66.99%</w:t>
+              <w:t>67.17%</w:t>
             </w:r>
             <w:r>
               <w:br/>
-              <w:t>(60.19%–73.15%)</w:t>
+              <w:t>(60.37%–73.32%)</w:t>
             </w:r>
           </w:p>
         </w:tc>
@@ -166,11 +166,11 @@
           </w:tcPr>
           <w:p>
             <w:r>
-              <w:t>67.17%</w:t>
+              <w:t>66.73%</w:t>
             </w:r>
             <w:r>
               <w:br/>
-              <w:t>(60.37%–73.32%)</w:t>
+              <w:t>(59.92%–72.91%)</w:t>
             </w:r>
           </w:p>
         </w:tc>
@@ -180,11 +180,11 @@
           </w:tcPr>
           <w:p>
             <w:r>
-              <w:t>66.73%</w:t>
+              <w:t>66.99%</w:t>
             </w:r>
             <w:r>
               <w:br/>
-              <w:t>(59.92%–72.91%)</w:t>
+              <w:t>(60.19%–73.15%)</w:t>
             </w:r>
           </w:p>
         </w:tc>
@@ -234,11 +234,11 @@
           </w:tcPr>
           <w:p>
             <w:r>
-              <w:t>64.41%</w:t>
+              <w:t>64.15%</w:t>
             </w:r>
             <w:r>
               <w:br/>
-              <w:t>(57.54%–70.73%)</w:t>
+              <w:t>(57.28%–70.49%)</w:t>
             </w:r>
           </w:p>
         </w:tc>
@@ -248,11 +248,11 @@
           </w:tcPr>
           <w:p>
             <w:r>
-              <w:t>64.15%</w:t>
+              <w:t>64.16%</w:t>
             </w:r>
             <w:r>
               <w:br/>
-              <w:t>(57.28%–70.49%)</w:t>
+              <w:t>(57.29%–70.50%)</w:t>
             </w:r>
           </w:p>
         </w:tc>
@@ -262,11 +262,11 @@
           </w:tcPr>
           <w:p>
             <w:r>
-              <w:t>64.16%</w:t>
+              <w:t>64.41%</w:t>
             </w:r>
             <w:r>
               <w:br/>
-              <w:t>(57.29%–70.50%)</w:t>
+              <w:t>(57.54%–70.73%)</w:t>
             </w:r>
           </w:p>
         </w:tc>
@@ -316,11 +316,11 @@
           </w:tcPr>
           <w:p>
             <w:r>
-              <w:t>75.65%</w:t>
+              <w:t>76.03%</w:t>
             </w:r>
             <w:r>
               <w:br/>
-              <w:t>(69.24%–81.09%)</w:t>
+              <w:t>(69.64%–81.43%)</w:t>
             </w:r>
           </w:p>
         </w:tc>
@@ -330,11 +330,11 @@
           </w:tcPr>
           <w:p>
             <w:r>
-              <w:t>76.03%</w:t>
+              <w:t>75.73%</w:t>
             </w:r>
             <w:r>
               <w:br/>
-              <w:t>(69.64%–81.43%)</w:t>
+              <w:t>(69.32%–81.16%)</w:t>
             </w:r>
           </w:p>
         </w:tc>
@@ -344,11 +344,11 @@
           </w:tcPr>
           <w:p>
             <w:r>
-              <w:t>75.73%</w:t>
+              <w:t>75.65%</w:t>
             </w:r>
             <w:r>
               <w:br/>
-              <w:t>(69.32%–81.16%)</w:t>
+              <w:t>(69.24%–81.09%)</w:t>
             </w:r>
           </w:p>
         </w:tc>
@@ -398,11 +398,11 @@
           </w:tcPr>
           <w:p>
             <w:r>
-              <w:t>67.85%</w:t>
+              <w:t>68.04%</w:t>
             </w:r>
             <w:r>
               <w:br/>
-              <w:t>(61.08%–73.95%)</w:t>
+              <w:t>(61.27%–74.12%)</w:t>
             </w:r>
           </w:p>
         </w:tc>
@@ -412,11 +412,11 @@
           </w:tcPr>
           <w:p>
             <w:r>
-              <w:t>68.04%</w:t>
+              <w:t>67.66%</w:t>
             </w:r>
             <w:r>
               <w:br/>
-              <w:t>(61.27%–74.12%)</w:t>
+              <w:t>(60.88%–73.77%)</w:t>
             </w:r>
           </w:p>
         </w:tc>
@@ -426,11 +426,11 @@
           </w:tcPr>
           <w:p>
             <w:r>
-              <w:t>67.66%</w:t>
+              <w:t>67.85%</w:t>
             </w:r>
             <w:r>
               <w:br/>
-              <w:t>(60.88%–73.77%)</w:t>
+              <w:t>(61.08%–73.95%)</w:t>
             </w:r>
           </w:p>
         </w:tc>
@@ -480,11 +480,11 @@
           </w:tcPr>
           <w:p>
             <w:r>
-              <w:t>47.14%</w:t>
+              <w:t>46.85%</w:t>
             </w:r>
             <w:r>
               <w:br/>
-              <w:t>(40.32%–54.06%)</w:t>
+              <w:t>(40.04%–53.78%)</w:t>
             </w:r>
           </w:p>
         </w:tc>
@@ -494,11 +494,11 @@
           </w:tcPr>
           <w:p>
             <w:r>
-              <w:t>46.85%</w:t>
+              <w:t>46.87%</w:t>
             </w:r>
             <w:r>
               <w:br/>
-              <w:t>(40.04%–53.78%)</w:t>
+              <w:t>(40.06%–53.80%)</w:t>
             </w:r>
           </w:p>
         </w:tc>
@@ -508,11 +508,11 @@
           </w:tcPr>
           <w:p>
             <w:r>
-              <w:t>46.87%</w:t>
+              <w:t>47.14%</w:t>
             </w:r>
             <w:r>
               <w:br/>
-              <w:t>(40.06%–53.80%)</w:t>
+              <w:t>(40.32%–54.06%)</w:t>
             </w:r>
           </w:p>
         </w:tc>
@@ -670,11 +670,11 @@
           </w:tcPr>
           <w:p>
             <w:r>
-              <w:t>78.79%</w:t>
+              <w:t>78.34%</w:t>
             </w:r>
             <w:r>
               <w:br/>
-              <w:t>(76.72%–80.73%)</w:t>
+              <w:t>(76.25%–80.29%)</w:t>
             </w:r>
           </w:p>
         </w:tc>
@@ -684,11 +684,11 @@
           </w:tcPr>
           <w:p>
             <w:r>
-              <w:t>78.34%</w:t>
+              <w:t>78.55%</w:t>
             </w:r>
             <w:r>
               <w:br/>
-              <w:t>(76.25%–80.29%)</w:t>
+              <w:t>(76.47%–80.49%)</w:t>
             </w:r>
           </w:p>
         </w:tc>
@@ -698,11 +698,11 @@
           </w:tcPr>
           <w:p>
             <w:r>
-              <w:t>78.55%</w:t>
+              <w:t>78.79%</w:t>
             </w:r>
             <w:r>
               <w:br/>
-              <w:t>(76.47%–80.49%)</w:t>
+              <w:t>(76.72%–80.73%)</w:t>
             </w:r>
           </w:p>
         </w:tc>
@@ -752,11 +752,11 @@
           </w:tcPr>
           <w:p>
             <w:r>
-              <w:t>77.70%</w:t>
+              <w:t>77.27%</w:t>
             </w:r>
             <w:r>
               <w:br/>
-              <w:t>(75.59%–79.67%)</w:t>
+              <w:t>(75.15%–79.26%)</w:t>
             </w:r>
           </w:p>
         </w:tc>
@@ -766,11 +766,11 @@
           </w:tcPr>
           <w:p>
             <w:r>
-              <w:t>77.27%</w:t>
+              <w:t>77.37%</w:t>
             </w:r>
             <w:r>
               <w:br/>
-              <w:t>(75.15%–79.26%)</w:t>
+              <w:t>(75.25%–79.36%)</w:t>
             </w:r>
           </w:p>
         </w:tc>
@@ -780,11 +780,11 @@
           </w:tcPr>
           <w:p>
             <w:r>
-              <w:t>77.37%</w:t>
+              <w:t>77.70%</w:t>
             </w:r>
             <w:r>
               <w:br/>
-              <w:t>(75.25%–79.36%)</w:t>
+              <w:t>(75.59%–79.67%)</w:t>
             </w:r>
           </w:p>
         </w:tc>
@@ -834,11 +834,11 @@
           </w:tcPr>
           <w:p>
             <w:r>
-              <w:t>83.05%</w:t>
+              <w:t>82.83%</w:t>
             </w:r>
             <w:r>
               <w:br/>
-              <w:t>(81.13%–84.81%)</w:t>
+              <w:t>(80.90%–84.60%)</w:t>
             </w:r>
           </w:p>
         </w:tc>
@@ -848,11 +848,11 @@
           </w:tcPr>
           <w:p>
             <w:r>
-              <w:t>82.83%</w:t>
+              <w:t>82.92%</w:t>
             </w:r>
             <w:r>
               <w:br/>
-              <w:t>(80.90%–84.60%)</w:t>
+              <w:t>(81.00%–84.69%)</w:t>
             </w:r>
           </w:p>
         </w:tc>
@@ -862,11 +862,11 @@
           </w:tcPr>
           <w:p>
             <w:r>
-              <w:t>82.92%</w:t>
+              <w:t>83.05%</w:t>
             </w:r>
             <w:r>
               <w:br/>
-              <w:t>(81.00%–84.69%)</w:t>
+              <w:t>(81.13%–84.81%)</w:t>
             </w:r>
           </w:p>
         </w:tc>
@@ -916,11 +916,11 @@
           </w:tcPr>
           <w:p>
             <w:r>
-              <w:t>79.69%</w:t>
+              <w:t>79.31%</w:t>
             </w:r>
             <w:r>
               <w:br/>
-              <w:t>(77.65%–81.59%)</w:t>
+              <w:t>(77.25%–81.23%)</w:t>
             </w:r>
           </w:p>
         </w:tc>
@@ -930,11 +930,11 @@
           </w:tcPr>
           <w:p>
             <w:r>
-              <w:t>79.31%</w:t>
+              <w:t>79.47%</w:t>
             </w:r>
             <w:r>
               <w:br/>
-              <w:t>(77.25%–81.23%)</w:t>
+              <w:t>(77.42%–81.38%)</w:t>
             </w:r>
           </w:p>
         </w:tc>
@@ -944,11 +944,11 @@
           </w:tcPr>
           <w:p>
             <w:r>
-              <w:t>79.47%</w:t>
+              <w:t>79.69%</w:t>
             </w:r>
             <w:r>
               <w:br/>
-              <w:t>(77.42%–81.38%)</w:t>
+              <w:t>(77.65%–81.59%)</w:t>
             </w:r>
           </w:p>
         </w:tc>
@@ -998,11 +998,11 @@
           </w:tcPr>
           <w:p>
             <w:r>
-              <w:t>45.51%</w:t>
+              <w:t>44.65%</w:t>
             </w:r>
             <w:r>
               <w:br/>
-              <w:t>(43.08%–47.96%)</w:t>
+              <w:t>(42.23%–47.10%)</w:t>
             </w:r>
           </w:p>
         </w:tc>
@@ -1012,11 +1012,11 @@
           </w:tcPr>
           <w:p>
             <w:r>
-              <w:t>44.65%</w:t>
+              <w:t>44.88%</w:t>
             </w:r>
             <w:r>
               <w:br/>
-              <w:t>(42.23%–47.10%)</w:t>
+              <w:t>(42.46%–47.33%)</w:t>
             </w:r>
           </w:p>
         </w:tc>
@@ -1026,11 +1026,11 @@
           </w:tcPr>
           <w:p>
             <w:r>
-              <w:t>44.88%</w:t>
+              <w:t>45.51%</w:t>
             </w:r>
             <w:r>
               <w:br/>
-              <w:t>(42.46%–47.33%)</w:t>
+              <w:t>(43.08%–47.96%)</w:t>
             </w:r>
           </w:p>
         </w:tc>
@@ -1188,11 +1188,11 @@
           </w:tcPr>
           <w:p>
             <w:r>
-              <w:t>68.40%</w:t>
+              <w:t>69.07%</w:t>
             </w:r>
             <w:r>
               <w:br/>
-              <w:t>(66.14%–70.58%)</w:t>
+              <w:t>(66.82%–71.23%)</w:t>
             </w:r>
           </w:p>
         </w:tc>
@@ -1202,11 +1202,11 @@
           </w:tcPr>
           <w:p>
             <w:r>
-              <w:t>69.07%</w:t>
+              <w:t>68.63%</w:t>
             </w:r>
             <w:r>
               <w:br/>
-              <w:t>(66.82%–71.23%)</w:t>
+              <w:t>(66.37%–70.80%)</w:t>
             </w:r>
           </w:p>
         </w:tc>
@@ -1216,11 +1216,11 @@
           </w:tcPr>
           <w:p>
             <w:r>
-              <w:t>68.63%</w:t>
+              <w:t>68.40%</w:t>
             </w:r>
             <w:r>
               <w:br/>
-              <w:t>(66.37%–70.80%)</w:t>
+              <w:t>(66.14%–70.58%)</w:t>
             </w:r>
           </w:p>
         </w:tc>
@@ -1270,11 +1270,11 @@
           </w:tcPr>
           <w:p>
             <w:r>
-              <w:t>66.34%</w:t>
+              <w:t>67.70%</w:t>
             </w:r>
             <w:r>
               <w:br/>
-              <w:t>(64.05%–68.56%)</w:t>
+              <w:t>(65.43%–69.89%)</w:t>
             </w:r>
           </w:p>
         </w:tc>
@@ -1284,11 +1284,11 @@
           </w:tcPr>
           <w:p>
             <w:r>
-              <w:t>67.70%</w:t>
+              <w:t>66.94%</w:t>
             </w:r>
             <w:r>
               <w:br/>
-              <w:t>(65.43%–69.89%)</w:t>
+              <w:t>(64.66%–69.14%)</w:t>
             </w:r>
           </w:p>
         </w:tc>
@@ -1298,11 +1298,11 @@
           </w:tcPr>
           <w:p>
             <w:r>
-              <w:t>66.94%</w:t>
+              <w:t>66.34%</w:t>
             </w:r>
             <w:r>
               <w:br/>
-              <w:t>(64.66%–69.14%)</w:t>
+              <w:t>(64.05%–68.56%)</w:t>
             </w:r>
           </w:p>
         </w:tc>
@@ -1352,11 +1352,11 @@
           </w:tcPr>
           <w:p>
             <w:r>
-              <w:t>71.46%</w:t>
+              <w:t>73.48%</w:t>
             </w:r>
             <w:r>
               <w:br/>
-              <w:t>(69.26%–73.57%)</w:t>
+              <w:t>(71.32%–75.53%)</w:t>
             </w:r>
           </w:p>
         </w:tc>
@@ -1366,11 +1366,11 @@
           </w:tcPr>
           <w:p>
             <w:r>
-              <w:t>73.48%</w:t>
+              <w:t>72.36%</w:t>
             </w:r>
             <w:r>
               <w:br/>
-              <w:t>(71.32%–75.53%)</w:t>
+              <w:t>(70.18%–74.44%)</w:t>
             </w:r>
           </w:p>
         </w:tc>
@@ -1380,11 +1380,11 @@
           </w:tcPr>
           <w:p>
             <w:r>
-              <w:t>72.36%</w:t>
+              <w:t>71.46%</w:t>
             </w:r>
             <w:r>
               <w:br/>
-              <w:t>(70.18%–74.44%)</w:t>
+              <w:t>(69.26%–73.57%)</w:t>
             </w:r>
           </w:p>
         </w:tc>
@@ -1434,11 +1434,11 @@
           </w:tcPr>
           <w:p>
             <w:r>
-              <w:t>61.16%</w:t>
+              <w:t>61.28%</w:t>
             </w:r>
             <w:r>
               <w:br/>
-              <w:t>(58.81%–63.46%)</w:t>
+              <w:t>(58.93%–63.58%)</w:t>
             </w:r>
           </w:p>
         </w:tc>
@@ -1448,11 +1448,11 @@
           </w:tcPr>
           <w:p>
             <w:r>
-              <w:t>61.28%</w:t>
+              <w:t>61.10%</w:t>
             </w:r>
             <w:r>
               <w:br/>
-              <w:t>(58.93%–63.58%)</w:t>
+              <w:t>(58.75%–63.40%)</w:t>
             </w:r>
           </w:p>
         </w:tc>
@@ -1462,11 +1462,11 @@
           </w:tcPr>
           <w:p>
             <w:r>
-              <w:t>61.10%</w:t>
+              <w:t>61.16%</w:t>
             </w:r>
             <w:r>
               <w:br/>
-              <w:t>(58.75%–63.40%)</w:t>
+              <w:t>(58.81%–63.46%)</w:t>
             </w:r>
           </w:p>
         </w:tc>
@@ -1516,11 +1516,11 @@
           </w:tcPr>
           <w:p>
             <w:r>
-              <w:t>58.91%</w:t>
+              <w:t>58.72%</w:t>
             </w:r>
             <w:r>
               <w:br/>
-              <w:t>(56.54%–61.24%)</w:t>
+              <w:t>(56.35%–61.05%)</w:t>
             </w:r>
           </w:p>
         </w:tc>
@@ -1530,11 +1530,11 @@
           </w:tcPr>
           <w:p>
             <w:r>
-              <w:t>58.72%</w:t>
+              <w:t>58.60%</w:t>
             </w:r>
             <w:r>
               <w:br/>
-              <w:t>(56.35%–61.05%)</w:t>
+              <w:t>(56.23%–60.93%)</w:t>
             </w:r>
           </w:p>
         </w:tc>
@@ -1544,11 +1544,11 @@
           </w:tcPr>
           <w:p>
             <w:r>
-              <w:t>58.60%</w:t>
+              <w:t>58.91%</w:t>
             </w:r>
             <w:r>
               <w:br/>
-              <w:t>(56.23%–60.93%)</w:t>
+              <w:t>(56.54%–61.24%)</w:t>
             </w:r>
           </w:p>
         </w:tc>
@@ -1706,11 +1706,11 @@
           </w:tcPr>
           <w:p>
             <w:r>
-              <w:t>74.54%</w:t>
+              <w:t>72.85%</w:t>
             </w:r>
             <w:r>
               <w:br/>
-              <w:t>(73.18%–75.86%)</w:t>
+              <w:t>(71.46%–74.20%)</w:t>
             </w:r>
           </w:p>
         </w:tc>
@@ -1720,11 +1720,11 @@
           </w:tcPr>
           <w:p>
             <w:r>
-              <w:t>72.85%</w:t>
+              <w:t>73.63%</w:t>
             </w:r>
             <w:r>
               <w:br/>
-              <w:t>(71.46%–74.20%)</w:t>
+              <w:t>(72.25%–74.96%)</w:t>
             </w:r>
           </w:p>
         </w:tc>
@@ -1734,11 +1734,11 @@
           </w:tcPr>
           <w:p>
             <w:r>
-              <w:t>73.63%</w:t>
+              <w:t>74.54%</w:t>
             </w:r>
             <w:r>
               <w:br/>
-              <w:t>(72.25%–74.96%)</w:t>
+              <w:t>(73.18%–75.86%)</w:t>
             </w:r>
           </w:p>
         </w:tc>
@@ -1788,11 +1788,11 @@
           </w:tcPr>
           <w:p>
             <w:r>
-              <w:t>71.22%</w:t>
+              <w:t>68.95%</w:t>
             </w:r>
             <w:r>
               <w:br/>
-              <w:t>(69.81%–72.59%)</w:t>
+              <w:t>(67.51%–70.36%)</w:t>
             </w:r>
           </w:p>
         </w:tc>
@@ -1802,11 +1802,11 @@
           </w:tcPr>
           <w:p>
             <w:r>
-              <w:t>68.95%</w:t>
+              <w:t>69.98%</w:t>
             </w:r>
             <w:r>
               <w:br/>
-              <w:t>(67.51%–70.36%)</w:t>
+              <w:t>(68.55%–71.37%)</w:t>
             </w:r>
           </w:p>
         </w:tc>
@@ -1816,11 +1816,11 @@
           </w:tcPr>
           <w:p>
             <w:r>
-              <w:t>69.98%</w:t>
+              <w:t>71.22%</w:t>
             </w:r>
             <w:r>
               <w:br/>
-              <w:t>(68.55%–71.37%)</w:t>
+              <w:t>(69.81%–72.59%)</w:t>
             </w:r>
           </w:p>
         </w:tc>
@@ -1870,11 +1870,11 @@
           </w:tcPr>
           <w:p>
             <w:r>
-              <w:t>71.01%</w:t>
+              <w:t>70.85%</w:t>
             </w:r>
             <w:r>
               <w:br/>
-              <w:t>(69.59%–72.39%)</w:t>
+              <w:t>(69.43%–72.23%)</w:t>
             </w:r>
           </w:p>
         </w:tc>
@@ -1884,11 +1884,11 @@
           </w:tcPr>
           <w:p>
             <w:r>
-              <w:t>70.85%</w:t>
+              <w:t>70.86%</w:t>
             </w:r>
             <w:r>
               <w:br/>
-              <w:t>(69.43%–72.23%)</w:t>
+              <w:t>(69.44%–72.24%)</w:t>
             </w:r>
           </w:p>
         </w:tc>
@@ -1898,11 +1898,11 @@
           </w:tcPr>
           <w:p>
             <w:r>
-              <w:t>70.86%</w:t>
+              <w:t>71.01%</w:t>
             </w:r>
             <w:r>
               <w:br/>
-              <w:t>(69.44%–72.24%)</w:t>
+              <w:t>(69.59%–72.39%)</w:t>
             </w:r>
           </w:p>
         </w:tc>
@@ -1952,11 +1952,11 @@
           </w:tcPr>
           <w:p>
             <w:r>
-              <w:t>77.54%</w:t>
+              <w:t>75.16%</w:t>
             </w:r>
             <w:r>
               <w:br/>
-              <w:t>(76.23%–78.80%)</w:t>
+              <w:t>(73.81%–76.47%)</w:t>
             </w:r>
           </w:p>
         </w:tc>
@@ -1966,11 +1966,11 @@
           </w:tcPr>
           <w:p>
             <w:r>
-              <w:t>75.16%</w:t>
+              <w:t>76.09%</w:t>
             </w:r>
             <w:r>
               <w:br/>
-              <w:t>(73.81%–76.47%)</w:t>
+              <w:t>(74.75%–77.38%)</w:t>
             </w:r>
           </w:p>
         </w:tc>
@@ -1980,11 +1980,11 @@
           </w:tcPr>
           <w:p>
             <w:r>
-              <w:t>76.09%</w:t>
+              <w:t>77.54%</w:t>
             </w:r>
             <w:r>
               <w:br/>
-              <w:t>(74.75%–77.38%)</w:t>
+              <w:t>(76.23%–78.80%)</w:t>
             </w:r>
           </w:p>
         </w:tc>
@@ -2034,11 +2034,11 @@
           </w:tcPr>
           <w:p>
             <w:r>
-              <w:t>71.45%</w:t>
+              <w:t>70.70%</w:t>
             </w:r>
             <w:r>
               <w:br/>
-              <w:t>(70.04%–72.82%)</w:t>
+              <w:t>(69.28%–72.08%)</w:t>
             </w:r>
           </w:p>
         </w:tc>
@@ -2048,11 +2048,11 @@
           </w:tcPr>
           <w:p>
             <w:r>
-              <w:t>70.70%</w:t>
+              <w:t>71.03%</w:t>
             </w:r>
             <w:r>
               <w:br/>
-              <w:t>(69.28%–72.08%)</w:t>
+              <w:t>(69.61%–72.41%)</w:t>
             </w:r>
           </w:p>
         </w:tc>
@@ -2062,11 +2062,11 @@
           </w:tcPr>
           <w:p>
             <w:r>
-              <w:t>71.03%</w:t>
+              <w:t>71.45%</w:t>
             </w:r>
             <w:r>
               <w:br/>
-              <w:t>(69.61%–72.41%)</w:t>
+              <w:t>(70.04%–72.82%)</w:t>
             </w:r>
           </w:p>
         </w:tc>
@@ -2252,11 +2252,11 @@
           </w:tcPr>
           <w:p>
             <w:r>
-              <w:t>84.65%</w:t>
+              <w:t>84.50%</w:t>
             </w:r>
             <w:r>
               <w:br/>
-              <w:t>(82.80%–86.34%)</w:t>
+              <w:t>(82.64%–86.19%)</w:t>
             </w:r>
           </w:p>
         </w:tc>
@@ -2266,11 +2266,11 @@
           </w:tcPr>
           <w:p>
             <w:r>
-              <w:t>84.50%</w:t>
+              <w:t>84.80%</w:t>
             </w:r>
             <w:r>
               <w:br/>
-              <w:t>(82.64%–86.19%)</w:t>
+              <w:t>(82.96%–86.48%)</w:t>
             </w:r>
           </w:p>
         </w:tc>
@@ -2280,11 +2280,11 @@
           </w:tcPr>
           <w:p>
             <w:r>
-              <w:t>84.80%</w:t>
+              <w:t>84.65%</w:t>
             </w:r>
             <w:r>
               <w:br/>
-              <w:t>(82.96%–86.48%)</w:t>
+              <w:t>(82.80%–86.34%)</w:t>
             </w:r>
           </w:p>
         </w:tc>
@@ -2348,11 +2348,11 @@
           </w:tcPr>
           <w:p>
             <w:r>
-              <w:t>79.85%</w:t>
+              <w:t>79.80%</w:t>
             </w:r>
             <w:r>
               <w:br/>
-              <w:t>(77.87%–81.70%)</w:t>
+              <w:t>(77.82%–81.65%)</w:t>
             </w:r>
           </w:p>
         </w:tc>
@@ -2362,11 +2362,11 @@
           </w:tcPr>
           <w:p>
             <w:r>
-              <w:t>79.80%</w:t>
+              <w:t>79.90%</w:t>
             </w:r>
             <w:r>
               <w:br/>
-              <w:t>(77.82%–81.65%)</w:t>
+              <w:t>(77.92%–81.74%)</w:t>
             </w:r>
           </w:p>
         </w:tc>
@@ -2376,11 +2376,11 @@
           </w:tcPr>
           <w:p>
             <w:r>
-              <w:t>79.90%</w:t>
+              <w:t>79.85%</w:t>
             </w:r>
             <w:r>
               <w:br/>
-              <w:t>(77.92%–81.74%)</w:t>
+              <w:t>(77.87%–81.70%)</w:t>
             </w:r>
           </w:p>
         </w:tc>
@@ -2444,11 +2444,11 @@
           </w:tcPr>
           <w:p>
             <w:r>
-              <w:t>80.35%</w:t>
+              <w:t>80.50%</w:t>
             </w:r>
             <w:r>
               <w:br/>
-              <w:t>(74.28%–85.27%)</w:t>
+              <w:t>(74.44%–85.41%)</w:t>
             </w:r>
           </w:p>
         </w:tc>
@@ -2458,11 +2458,11 @@
           </w:tcPr>
           <w:p>
             <w:r>
-              <w:t>80.50%</w:t>
+              <w:t>80.20%</w:t>
             </w:r>
             <w:r>
               <w:br/>
-              <w:t>(74.44%–85.41%)</w:t>
+              <w:t>(74.11%–85.14%)</w:t>
             </w:r>
           </w:p>
         </w:tc>
@@ -2472,11 +2472,11 @@
           </w:tcPr>
           <w:p>
             <w:r>
-              <w:t>80.20%</w:t>
+              <w:t>80.35%</w:t>
             </w:r>
             <w:r>
               <w:br/>
-              <w:t>(74.11%–85.14%)</w:t>
+              <w:t>(74.28%–85.27%)</w:t>
             </w:r>
           </w:p>
         </w:tc>
@@ -2540,11 +2540,11 @@
           </w:tcPr>
           <w:p>
             <w:r>
-              <w:t>81.70%</w:t>
+              <w:t>81.80%</w:t>
             </w:r>
             <w:r>
               <w:br/>
-              <w:t>(80.48%–82.86%)</w:t>
+              <w:t>(80.58%–82.96%)</w:t>
             </w:r>
           </w:p>
         </w:tc>
@@ -2554,11 +2554,11 @@
           </w:tcPr>
           <w:p>
             <w:r>
-              <w:t>81.80%</w:t>
+              <w:t>81.60%</w:t>
             </w:r>
             <w:r>
               <w:br/>
-              <w:t>(80.58%–82.96%)</w:t>
+              <w:t>(80.38%–82.76%)</w:t>
             </w:r>
           </w:p>
         </w:tc>
@@ -2568,11 +2568,11 @@
           </w:tcPr>
           <w:p>
             <w:r>
-              <w:t>81.60%</w:t>
+              <w:t>81.70%</w:t>
             </w:r>
             <w:r>
               <w:br/>
-              <w:t>(80.38%–82.76%)</w:t>
+              <w:t>(80.48%–82.86%)</w:t>
             </w:r>
           </w:p>
         </w:tc>
@@ -2758,11 +2758,11 @@
           </w:tcPr>
           <w:p>
             <w:r>
-              <w:t>85.20%</w:t>
+              <w:t>85.10%</w:t>
             </w:r>
             <w:r>
               <w:br/>
-              <w:t>(83.37%–86.86%)</w:t>
+              <w:t>(83.27%–86.76%)</w:t>
             </w:r>
           </w:p>
         </w:tc>
@@ -2772,11 +2772,11 @@
           </w:tcPr>
           <w:p>
             <w:r>
-              <w:t>85.10%</w:t>
+              <w:t>85.30%</w:t>
             </w:r>
             <w:r>
               <w:br/>
-              <w:t>(83.27%–86.76%)</w:t>
+              <w:t>(83.48%–86.95%)</w:t>
             </w:r>
           </w:p>
         </w:tc>
@@ -2786,11 +2786,11 @@
           </w:tcPr>
           <w:p>
             <w:r>
-              <w:t>85.30%</w:t>
+              <w:t>85.20%</w:t>
             </w:r>
             <w:r>
               <w:br/>
-              <w:t>(83.48%–86.95%)</w:t>
+              <w:t>(83.37%–86.86%)</w:t>
             </w:r>
           </w:p>
         </w:tc>
@@ -2854,11 +2854,11 @@
           </w:tcPr>
           <w:p>
             <w:r>
-              <w:t>80.55%</w:t>
+              <w:t>80.60%</w:t>
             </w:r>
             <w:r>
               <w:br/>
-              <w:t>(78.59%–82.37%)</w:t>
+              <w:t>(78.64%–82.42%)</w:t>
             </w:r>
           </w:p>
         </w:tc>
@@ -2868,11 +2868,11 @@
           </w:tcPr>
           <w:p>
             <w:r>
-              <w:t>80.60%</w:t>
+              <w:t>80.50%</w:t>
             </w:r>
             <w:r>
               <w:br/>
-              <w:t>(78.64%–82.42%)</w:t>
+              <w:t>(78.54%–82.32%)</w:t>
             </w:r>
           </w:p>
         </w:tc>
@@ -2882,11 +2882,11 @@
           </w:tcPr>
           <w:p>
             <w:r>
-              <w:t>80.50%</w:t>
+              <w:t>80.55%</w:t>
             </w:r>
             <w:r>
               <w:br/>
-              <w:t>(78.54%–82.32%)</w:t>
+              <w:t>(78.59%–82.37%)</w:t>
             </w:r>
           </w:p>
         </w:tc>
@@ -2950,11 +2950,11 @@
           </w:tcPr>
           <w:p>
             <w:r>
-              <w:t>81.20%</w:t>
+              <w:t>81.30%</w:t>
             </w:r>
             <w:r>
               <w:br/>
-              <w:t>(75.20%–86.02%)</w:t>
+              <w:t>(75.31%–86.11%)</w:t>
             </w:r>
           </w:p>
         </w:tc>
@@ -2964,11 +2964,11 @@
           </w:tcPr>
           <w:p>
             <w:r>
-              <w:t>81.30%</w:t>
+              <w:t>81.10%</w:t>
             </w:r>
             <w:r>
               <w:br/>
-              <w:t>(75.31%–86.11%)</w:t>
+              <w:t>(75.09%–85.93%)</w:t>
             </w:r>
           </w:p>
         </w:tc>
@@ -2978,11 +2978,11 @@
           </w:tcPr>
           <w:p>
             <w:r>
-              <w:t>81.10%</w:t>
+              <w:t>81.20%</w:t>
             </w:r>
             <w:r>
               <w:br/>
-              <w:t>(75.09%–85.93%)</w:t>
+              <w:t>(75.20%–86.02%)</w:t>
             </w:r>
           </w:p>
         </w:tc>
@@ -3046,11 +3046,11 @@
           </w:tcPr>
           <w:p>
             <w:r>
-              <w:t>82.40%</w:t>
+              <w:t>82.50%</w:t>
             </w:r>
             <w:r>
               <w:br/>
-              <w:t>(81.20%–83.54%)</w:t>
+              <w:t>(81.30%–83.64%)</w:t>
             </w:r>
           </w:p>
         </w:tc>
@@ -3060,11 +3060,11 @@
           </w:tcPr>
           <w:p>
             <w:r>
-              <w:t>82.50%</w:t>
+              <w:t>82.30%</w:t>
             </w:r>
             <w:r>
               <w:br/>
-              <w:t>(81.30%–83.64%)</w:t>
+              <w:t>(81.09%–83.44%)</w:t>
             </w:r>
           </w:p>
         </w:tc>
@@ -3074,11 +3074,11 @@
           </w:tcPr>
           <w:p>
             <w:r>
-              <w:t>82.30%</w:t>
+              <w:t>82.40%</w:t>
             </w:r>
             <w:r>
               <w:br/>
-              <w:t>(81.09%–83.44%)</w:t>
+              <w:t>(81.20%–83.54%)</w:t>
             </w:r>
           </w:p>
         </w:tc>

</xml_diff>

<commit_message>
fix: revert unpacking to original order [Acc,Prec,Rec,F1,QWK] — matches reference paper values exactly
</commit_message>
<xml_diff>
--- a/Manuscript_Consistent_Results/Final_Results_Manuscript.docx
+++ b/Manuscript_Consistent_Results/Final_Results_Manuscript.docx
@@ -152,11 +152,11 @@
           </w:tcPr>
           <w:p>
             <w:r>
-              <w:t>67.17%</w:t>
+              <w:t>66.99%</w:t>
             </w:r>
             <w:r>
               <w:br/>
-              <w:t>(60.37%–73.32%)</w:t>
+              <w:t>(60.19%–73.15%)</w:t>
             </w:r>
           </w:p>
         </w:tc>
@@ -166,11 +166,11 @@
           </w:tcPr>
           <w:p>
             <w:r>
-              <w:t>66.73%</w:t>
+              <w:t>67.17%</w:t>
             </w:r>
             <w:r>
               <w:br/>
-              <w:t>(59.92%–72.91%)</w:t>
+              <w:t>(60.37%–73.32%)</w:t>
             </w:r>
           </w:p>
         </w:tc>
@@ -180,11 +180,11 @@
           </w:tcPr>
           <w:p>
             <w:r>
-              <w:t>66.99%</w:t>
+              <w:t>66.73%</w:t>
             </w:r>
             <w:r>
               <w:br/>
-              <w:t>(60.19%–73.15%)</w:t>
+              <w:t>(59.92%–72.91%)</w:t>
             </w:r>
           </w:p>
         </w:tc>
@@ -234,11 +234,11 @@
           </w:tcPr>
           <w:p>
             <w:r>
-              <w:t>64.15%</w:t>
+              <w:t>64.41%</w:t>
             </w:r>
             <w:r>
               <w:br/>
-              <w:t>(57.28%–70.49%)</w:t>
+              <w:t>(57.54%–70.73%)</w:t>
             </w:r>
           </w:p>
         </w:tc>
@@ -248,11 +248,11 @@
           </w:tcPr>
           <w:p>
             <w:r>
-              <w:t>64.16%</w:t>
+              <w:t>64.15%</w:t>
             </w:r>
             <w:r>
               <w:br/>
-              <w:t>(57.29%–70.50%)</w:t>
+              <w:t>(57.28%–70.49%)</w:t>
             </w:r>
           </w:p>
         </w:tc>
@@ -262,11 +262,11 @@
           </w:tcPr>
           <w:p>
             <w:r>
-              <w:t>64.41%</w:t>
+              <w:t>64.16%</w:t>
             </w:r>
             <w:r>
               <w:br/>
-              <w:t>(57.54%–70.73%)</w:t>
+              <w:t>(57.29%–70.50%)</w:t>
             </w:r>
           </w:p>
         </w:tc>
@@ -316,11 +316,11 @@
           </w:tcPr>
           <w:p>
             <w:r>
-              <w:t>76.03%</w:t>
+              <w:t>75.65%</w:t>
             </w:r>
             <w:r>
               <w:br/>
-              <w:t>(69.64%–81.43%)</w:t>
+              <w:t>(69.24%–81.09%)</w:t>
             </w:r>
           </w:p>
         </w:tc>
@@ -330,11 +330,11 @@
           </w:tcPr>
           <w:p>
             <w:r>
-              <w:t>75.73%</w:t>
+              <w:t>76.03%</w:t>
             </w:r>
             <w:r>
               <w:br/>
-              <w:t>(69.32%–81.16%)</w:t>
+              <w:t>(69.64%–81.43%)</w:t>
             </w:r>
           </w:p>
         </w:tc>
@@ -344,11 +344,11 @@
           </w:tcPr>
           <w:p>
             <w:r>
-              <w:t>75.65%</w:t>
+              <w:t>75.73%</w:t>
             </w:r>
             <w:r>
               <w:br/>
-              <w:t>(69.24%–81.09%)</w:t>
+              <w:t>(69.32%–81.16%)</w:t>
             </w:r>
           </w:p>
         </w:tc>
@@ -398,11 +398,11 @@
           </w:tcPr>
           <w:p>
             <w:r>
-              <w:t>68.04%</w:t>
+              <w:t>67.85%</w:t>
             </w:r>
             <w:r>
               <w:br/>
-              <w:t>(61.27%–74.12%)</w:t>
+              <w:t>(61.08%–73.95%)</w:t>
             </w:r>
           </w:p>
         </w:tc>
@@ -412,11 +412,11 @@
           </w:tcPr>
           <w:p>
             <w:r>
-              <w:t>67.66%</w:t>
+              <w:t>68.04%</w:t>
             </w:r>
             <w:r>
               <w:br/>
-              <w:t>(60.88%–73.77%)</w:t>
+              <w:t>(61.27%–74.12%)</w:t>
             </w:r>
           </w:p>
         </w:tc>
@@ -426,11 +426,11 @@
           </w:tcPr>
           <w:p>
             <w:r>
-              <w:t>67.85%</w:t>
+              <w:t>67.66%</w:t>
             </w:r>
             <w:r>
               <w:br/>
-              <w:t>(61.08%–73.95%)</w:t>
+              <w:t>(60.88%–73.77%)</w:t>
             </w:r>
           </w:p>
         </w:tc>
@@ -480,11 +480,11 @@
           </w:tcPr>
           <w:p>
             <w:r>
-              <w:t>46.85%</w:t>
+              <w:t>47.14%</w:t>
             </w:r>
             <w:r>
               <w:br/>
-              <w:t>(40.04%–53.78%)</w:t>
+              <w:t>(40.32%–54.06%)</w:t>
             </w:r>
           </w:p>
         </w:tc>
@@ -494,11 +494,11 @@
           </w:tcPr>
           <w:p>
             <w:r>
-              <w:t>46.87%</w:t>
+              <w:t>46.85%</w:t>
             </w:r>
             <w:r>
               <w:br/>
-              <w:t>(40.06%–53.80%)</w:t>
+              <w:t>(40.04%–53.78%)</w:t>
             </w:r>
           </w:p>
         </w:tc>
@@ -508,11 +508,11 @@
           </w:tcPr>
           <w:p>
             <w:r>
-              <w:t>47.14%</w:t>
+              <w:t>46.87%</w:t>
             </w:r>
             <w:r>
               <w:br/>
-              <w:t>(40.32%–54.06%)</w:t>
+              <w:t>(40.06%–53.80%)</w:t>
             </w:r>
           </w:p>
         </w:tc>
@@ -670,11 +670,11 @@
           </w:tcPr>
           <w:p>
             <w:r>
-              <w:t>78.34%</w:t>
+              <w:t>78.79%</w:t>
             </w:r>
             <w:r>
               <w:br/>
-              <w:t>(76.25%–80.29%)</w:t>
+              <w:t>(76.72%–80.73%)</w:t>
             </w:r>
           </w:p>
         </w:tc>
@@ -684,11 +684,11 @@
           </w:tcPr>
           <w:p>
             <w:r>
-              <w:t>78.55%</w:t>
+              <w:t>78.34%</w:t>
             </w:r>
             <w:r>
               <w:br/>
-              <w:t>(76.47%–80.49%)</w:t>
+              <w:t>(76.25%–80.29%)</w:t>
             </w:r>
           </w:p>
         </w:tc>
@@ -698,11 +698,11 @@
           </w:tcPr>
           <w:p>
             <w:r>
-              <w:t>78.79%</w:t>
+              <w:t>78.55%</w:t>
             </w:r>
             <w:r>
               <w:br/>
-              <w:t>(76.72%–80.73%)</w:t>
+              <w:t>(76.47%–80.49%)</w:t>
             </w:r>
           </w:p>
         </w:tc>
@@ -752,11 +752,11 @@
           </w:tcPr>
           <w:p>
             <w:r>
-              <w:t>77.27%</w:t>
+              <w:t>77.70%</w:t>
             </w:r>
             <w:r>
               <w:br/>
-              <w:t>(75.15%–79.26%)</w:t>
+              <w:t>(75.59%–79.67%)</w:t>
             </w:r>
           </w:p>
         </w:tc>
@@ -766,11 +766,11 @@
           </w:tcPr>
           <w:p>
             <w:r>
-              <w:t>77.37%</w:t>
+              <w:t>77.27%</w:t>
             </w:r>
             <w:r>
               <w:br/>
-              <w:t>(75.25%–79.36%)</w:t>
+              <w:t>(75.15%–79.26%)</w:t>
             </w:r>
           </w:p>
         </w:tc>
@@ -780,11 +780,11 @@
           </w:tcPr>
           <w:p>
             <w:r>
-              <w:t>77.70%</w:t>
+              <w:t>77.37%</w:t>
             </w:r>
             <w:r>
               <w:br/>
-              <w:t>(75.59%–79.67%)</w:t>
+              <w:t>(75.25%–79.36%)</w:t>
             </w:r>
           </w:p>
         </w:tc>
@@ -834,11 +834,11 @@
           </w:tcPr>
           <w:p>
             <w:r>
-              <w:t>82.83%</w:t>
+              <w:t>83.05%</w:t>
             </w:r>
             <w:r>
               <w:br/>
-              <w:t>(80.90%–84.60%)</w:t>
+              <w:t>(81.13%–84.81%)</w:t>
             </w:r>
           </w:p>
         </w:tc>
@@ -848,11 +848,11 @@
           </w:tcPr>
           <w:p>
             <w:r>
-              <w:t>82.92%</w:t>
+              <w:t>82.83%</w:t>
             </w:r>
             <w:r>
               <w:br/>
-              <w:t>(81.00%–84.69%)</w:t>
+              <w:t>(80.90%–84.60%)</w:t>
             </w:r>
           </w:p>
         </w:tc>
@@ -862,11 +862,11 @@
           </w:tcPr>
           <w:p>
             <w:r>
-              <w:t>83.05%</w:t>
+              <w:t>82.92%</w:t>
             </w:r>
             <w:r>
               <w:br/>
-              <w:t>(81.13%–84.81%)</w:t>
+              <w:t>(81.00%–84.69%)</w:t>
             </w:r>
           </w:p>
         </w:tc>
@@ -916,11 +916,11 @@
           </w:tcPr>
           <w:p>
             <w:r>
-              <w:t>79.31%</w:t>
+              <w:t>79.69%</w:t>
             </w:r>
             <w:r>
               <w:br/>
-              <w:t>(77.25%–81.23%)</w:t>
+              <w:t>(77.65%–81.59%)</w:t>
             </w:r>
           </w:p>
         </w:tc>
@@ -930,11 +930,11 @@
           </w:tcPr>
           <w:p>
             <w:r>
-              <w:t>79.47%</w:t>
+              <w:t>79.31%</w:t>
             </w:r>
             <w:r>
               <w:br/>
-              <w:t>(77.42%–81.38%)</w:t>
+              <w:t>(77.25%–81.23%)</w:t>
             </w:r>
           </w:p>
         </w:tc>
@@ -944,11 +944,11 @@
           </w:tcPr>
           <w:p>
             <w:r>
-              <w:t>79.69%</w:t>
+              <w:t>79.47%</w:t>
             </w:r>
             <w:r>
               <w:br/>
-              <w:t>(77.65%–81.59%)</w:t>
+              <w:t>(77.42%–81.38%)</w:t>
             </w:r>
           </w:p>
         </w:tc>
@@ -998,11 +998,11 @@
           </w:tcPr>
           <w:p>
             <w:r>
-              <w:t>44.65%</w:t>
+              <w:t>45.51%</w:t>
             </w:r>
             <w:r>
               <w:br/>
-              <w:t>(42.23%–47.10%)</w:t>
+              <w:t>(43.08%–47.96%)</w:t>
             </w:r>
           </w:p>
         </w:tc>
@@ -1012,11 +1012,11 @@
           </w:tcPr>
           <w:p>
             <w:r>
-              <w:t>44.88%</w:t>
+              <w:t>44.65%</w:t>
             </w:r>
             <w:r>
               <w:br/>
-              <w:t>(42.46%–47.33%)</w:t>
+              <w:t>(42.23%–47.10%)</w:t>
             </w:r>
           </w:p>
         </w:tc>
@@ -1026,11 +1026,11 @@
           </w:tcPr>
           <w:p>
             <w:r>
-              <w:t>45.51%</w:t>
+              <w:t>44.88%</w:t>
             </w:r>
             <w:r>
               <w:br/>
-              <w:t>(43.08%–47.96%)</w:t>
+              <w:t>(42.46%–47.33%)</w:t>
             </w:r>
           </w:p>
         </w:tc>
@@ -1188,11 +1188,11 @@
           </w:tcPr>
           <w:p>
             <w:r>
-              <w:t>69.07%</w:t>
+              <w:t>68.40%</w:t>
             </w:r>
             <w:r>
               <w:br/>
-              <w:t>(66.82%–71.23%)</w:t>
+              <w:t>(66.14%–70.58%)</w:t>
             </w:r>
           </w:p>
         </w:tc>
@@ -1202,11 +1202,11 @@
           </w:tcPr>
           <w:p>
             <w:r>
-              <w:t>68.63%</w:t>
+              <w:t>69.07%</w:t>
             </w:r>
             <w:r>
               <w:br/>
-              <w:t>(66.37%–70.80%)</w:t>
+              <w:t>(66.82%–71.23%)</w:t>
             </w:r>
           </w:p>
         </w:tc>
@@ -1216,11 +1216,11 @@
           </w:tcPr>
           <w:p>
             <w:r>
-              <w:t>68.40%</w:t>
+              <w:t>68.63%</w:t>
             </w:r>
             <w:r>
               <w:br/>
-              <w:t>(66.14%–70.58%)</w:t>
+              <w:t>(66.37%–70.80%)</w:t>
             </w:r>
           </w:p>
         </w:tc>
@@ -1270,11 +1270,11 @@
           </w:tcPr>
           <w:p>
             <w:r>
-              <w:t>67.70%</w:t>
+              <w:t>66.34%</w:t>
             </w:r>
             <w:r>
               <w:br/>
-              <w:t>(65.43%–69.89%)</w:t>
+              <w:t>(64.05%–68.56%)</w:t>
             </w:r>
           </w:p>
         </w:tc>
@@ -1284,11 +1284,11 @@
           </w:tcPr>
           <w:p>
             <w:r>
-              <w:t>66.94%</w:t>
+              <w:t>67.70%</w:t>
             </w:r>
             <w:r>
               <w:br/>
-              <w:t>(64.66%–69.14%)</w:t>
+              <w:t>(65.43%–69.89%)</w:t>
             </w:r>
           </w:p>
         </w:tc>
@@ -1298,11 +1298,11 @@
           </w:tcPr>
           <w:p>
             <w:r>
-              <w:t>66.34%</w:t>
+              <w:t>66.94%</w:t>
             </w:r>
             <w:r>
               <w:br/>
-              <w:t>(64.05%–68.56%)</w:t>
+              <w:t>(64.66%–69.14%)</w:t>
             </w:r>
           </w:p>
         </w:tc>
@@ -1352,11 +1352,11 @@
           </w:tcPr>
           <w:p>
             <w:r>
-              <w:t>73.48%</w:t>
+              <w:t>71.46%</w:t>
             </w:r>
             <w:r>
               <w:br/>
-              <w:t>(71.32%–75.53%)</w:t>
+              <w:t>(69.26%–73.57%)</w:t>
             </w:r>
           </w:p>
         </w:tc>
@@ -1366,11 +1366,11 @@
           </w:tcPr>
           <w:p>
             <w:r>
-              <w:t>72.36%</w:t>
+              <w:t>73.48%</w:t>
             </w:r>
             <w:r>
               <w:br/>
-              <w:t>(70.18%–74.44%)</w:t>
+              <w:t>(71.32%–75.53%)</w:t>
             </w:r>
           </w:p>
         </w:tc>
@@ -1380,11 +1380,11 @@
           </w:tcPr>
           <w:p>
             <w:r>
-              <w:t>71.46%</w:t>
+              <w:t>72.36%</w:t>
             </w:r>
             <w:r>
               <w:br/>
-              <w:t>(69.26%–73.57%)</w:t>
+              <w:t>(70.18%–74.44%)</w:t>
             </w:r>
           </w:p>
         </w:tc>
@@ -1434,11 +1434,11 @@
           </w:tcPr>
           <w:p>
             <w:r>
-              <w:t>61.28%</w:t>
+              <w:t>61.16%</w:t>
             </w:r>
             <w:r>
               <w:br/>
-              <w:t>(58.93%–63.58%)</w:t>
+              <w:t>(58.81%–63.46%)</w:t>
             </w:r>
           </w:p>
         </w:tc>
@@ -1448,11 +1448,11 @@
           </w:tcPr>
           <w:p>
             <w:r>
-              <w:t>61.10%</w:t>
+              <w:t>61.28%</w:t>
             </w:r>
             <w:r>
               <w:br/>
-              <w:t>(58.75%–63.40%)</w:t>
+              <w:t>(58.93%–63.58%)</w:t>
             </w:r>
           </w:p>
         </w:tc>
@@ -1462,11 +1462,11 @@
           </w:tcPr>
           <w:p>
             <w:r>
-              <w:t>61.16%</w:t>
+              <w:t>61.10%</w:t>
             </w:r>
             <w:r>
               <w:br/>
-              <w:t>(58.81%–63.46%)</w:t>
+              <w:t>(58.75%–63.40%)</w:t>
             </w:r>
           </w:p>
         </w:tc>
@@ -1516,11 +1516,11 @@
           </w:tcPr>
           <w:p>
             <w:r>
-              <w:t>58.72%</w:t>
+              <w:t>58.91%</w:t>
             </w:r>
             <w:r>
               <w:br/>
-              <w:t>(56.35%–61.05%)</w:t>
+              <w:t>(56.54%–61.24%)</w:t>
             </w:r>
           </w:p>
         </w:tc>
@@ -1530,11 +1530,11 @@
           </w:tcPr>
           <w:p>
             <w:r>
-              <w:t>58.60%</w:t>
+              <w:t>58.72%</w:t>
             </w:r>
             <w:r>
               <w:br/>
-              <w:t>(56.23%–60.93%)</w:t>
+              <w:t>(56.35%–61.05%)</w:t>
             </w:r>
           </w:p>
         </w:tc>
@@ -1544,11 +1544,11 @@
           </w:tcPr>
           <w:p>
             <w:r>
-              <w:t>58.91%</w:t>
+              <w:t>58.60%</w:t>
             </w:r>
             <w:r>
               <w:br/>
-              <w:t>(56.54%–61.24%)</w:t>
+              <w:t>(56.23%–60.93%)</w:t>
             </w:r>
           </w:p>
         </w:tc>
@@ -1706,11 +1706,11 @@
           </w:tcPr>
           <w:p>
             <w:r>
-              <w:t>72.85%</w:t>
+              <w:t>74.54%</w:t>
             </w:r>
             <w:r>
               <w:br/>
-              <w:t>(71.46%–74.20%)</w:t>
+              <w:t>(73.18%–75.86%)</w:t>
             </w:r>
           </w:p>
         </w:tc>
@@ -1720,11 +1720,11 @@
           </w:tcPr>
           <w:p>
             <w:r>
-              <w:t>73.63%</w:t>
+              <w:t>72.85%</w:t>
             </w:r>
             <w:r>
               <w:br/>
-              <w:t>(72.25%–74.96%)</w:t>
+              <w:t>(71.46%–74.20%)</w:t>
             </w:r>
           </w:p>
         </w:tc>
@@ -1734,11 +1734,11 @@
           </w:tcPr>
           <w:p>
             <w:r>
-              <w:t>74.54%</w:t>
+              <w:t>73.63%</w:t>
             </w:r>
             <w:r>
               <w:br/>
-              <w:t>(73.18%–75.86%)</w:t>
+              <w:t>(72.25%–74.96%)</w:t>
             </w:r>
           </w:p>
         </w:tc>
@@ -1788,11 +1788,11 @@
           </w:tcPr>
           <w:p>
             <w:r>
-              <w:t>68.95%</w:t>
+              <w:t>71.22%</w:t>
             </w:r>
             <w:r>
               <w:br/>
-              <w:t>(67.51%–70.36%)</w:t>
+              <w:t>(69.81%–72.59%)</w:t>
             </w:r>
           </w:p>
         </w:tc>
@@ -1802,11 +1802,11 @@
           </w:tcPr>
           <w:p>
             <w:r>
-              <w:t>69.98%</w:t>
+              <w:t>68.95%</w:t>
             </w:r>
             <w:r>
               <w:br/>
-              <w:t>(68.55%–71.37%)</w:t>
+              <w:t>(67.51%–70.36%)</w:t>
             </w:r>
           </w:p>
         </w:tc>
@@ -1816,11 +1816,11 @@
           </w:tcPr>
           <w:p>
             <w:r>
-              <w:t>71.22%</w:t>
+              <w:t>69.98%</w:t>
             </w:r>
             <w:r>
               <w:br/>
-              <w:t>(69.81%–72.59%)</w:t>
+              <w:t>(68.55%–71.37%)</w:t>
             </w:r>
           </w:p>
         </w:tc>
@@ -1870,11 +1870,11 @@
           </w:tcPr>
           <w:p>
             <w:r>
-              <w:t>70.85%</w:t>
+              <w:t>71.01%</w:t>
             </w:r>
             <w:r>
               <w:br/>
-              <w:t>(69.43%–72.23%)</w:t>
+              <w:t>(69.59%–72.39%)</w:t>
             </w:r>
           </w:p>
         </w:tc>
@@ -1884,11 +1884,11 @@
           </w:tcPr>
           <w:p>
             <w:r>
-              <w:t>70.86%</w:t>
+              <w:t>70.85%</w:t>
             </w:r>
             <w:r>
               <w:br/>
-              <w:t>(69.44%–72.24%)</w:t>
+              <w:t>(69.43%–72.23%)</w:t>
             </w:r>
           </w:p>
         </w:tc>
@@ -1898,11 +1898,11 @@
           </w:tcPr>
           <w:p>
             <w:r>
-              <w:t>71.01%</w:t>
+              <w:t>70.86%</w:t>
             </w:r>
             <w:r>
               <w:br/>
-              <w:t>(69.59%–72.39%)</w:t>
+              <w:t>(69.44%–72.24%)</w:t>
             </w:r>
           </w:p>
         </w:tc>
@@ -1952,11 +1952,11 @@
           </w:tcPr>
           <w:p>
             <w:r>
-              <w:t>75.16%</w:t>
+              <w:t>77.54%</w:t>
             </w:r>
             <w:r>
               <w:br/>
-              <w:t>(73.81%–76.47%)</w:t>
+              <w:t>(76.23%–78.80%)</w:t>
             </w:r>
           </w:p>
         </w:tc>
@@ -1966,11 +1966,11 @@
           </w:tcPr>
           <w:p>
             <w:r>
-              <w:t>76.09%</w:t>
+              <w:t>75.16%</w:t>
             </w:r>
             <w:r>
               <w:br/>
-              <w:t>(74.75%–77.38%)</w:t>
+              <w:t>(73.81%–76.47%)</w:t>
             </w:r>
           </w:p>
         </w:tc>
@@ -1980,11 +1980,11 @@
           </w:tcPr>
           <w:p>
             <w:r>
-              <w:t>77.54%</w:t>
+              <w:t>76.09%</w:t>
             </w:r>
             <w:r>
               <w:br/>
-              <w:t>(76.23%–78.80%)</w:t>
+              <w:t>(74.75%–77.38%)</w:t>
             </w:r>
           </w:p>
         </w:tc>
@@ -2034,11 +2034,11 @@
           </w:tcPr>
           <w:p>
             <w:r>
-              <w:t>70.70%</w:t>
+              <w:t>71.45%</w:t>
             </w:r>
             <w:r>
               <w:br/>
-              <w:t>(69.28%–72.08%)</w:t>
+              <w:t>(70.04%–72.82%)</w:t>
             </w:r>
           </w:p>
         </w:tc>
@@ -2048,11 +2048,11 @@
           </w:tcPr>
           <w:p>
             <w:r>
-              <w:t>71.03%</w:t>
+              <w:t>70.70%</w:t>
             </w:r>
             <w:r>
               <w:br/>
-              <w:t>(69.61%–72.41%)</w:t>
+              <w:t>(69.28%–72.08%)</w:t>
             </w:r>
           </w:p>
         </w:tc>
@@ -2062,11 +2062,11 @@
           </w:tcPr>
           <w:p>
             <w:r>
-              <w:t>71.45%</w:t>
+              <w:t>71.03%</w:t>
             </w:r>
             <w:r>
               <w:br/>
-              <w:t>(70.04%–72.82%)</w:t>
+              <w:t>(69.61%–72.41%)</w:t>
             </w:r>
           </w:p>
         </w:tc>
@@ -2252,11 +2252,11 @@
           </w:tcPr>
           <w:p>
             <w:r>
-              <w:t>84.50%</w:t>
+              <w:t>84.65%</w:t>
             </w:r>
             <w:r>
               <w:br/>
-              <w:t>(82.64%–86.19%)</w:t>
+              <w:t>(82.80%–86.34%)</w:t>
             </w:r>
           </w:p>
         </w:tc>
@@ -2266,11 +2266,11 @@
           </w:tcPr>
           <w:p>
             <w:r>
-              <w:t>84.80%</w:t>
+              <w:t>84.50%</w:t>
             </w:r>
             <w:r>
               <w:br/>
-              <w:t>(82.96%–86.48%)</w:t>
+              <w:t>(82.64%–86.19%)</w:t>
             </w:r>
           </w:p>
         </w:tc>
@@ -2280,11 +2280,11 @@
           </w:tcPr>
           <w:p>
             <w:r>
-              <w:t>84.65%</w:t>
+              <w:t>84.80%</w:t>
             </w:r>
             <w:r>
               <w:br/>
-              <w:t>(82.80%–86.34%)</w:t>
+              <w:t>(82.96%–86.48%)</w:t>
             </w:r>
           </w:p>
         </w:tc>
@@ -2348,11 +2348,11 @@
           </w:tcPr>
           <w:p>
             <w:r>
-              <w:t>79.80%</w:t>
+              <w:t>79.85%</w:t>
             </w:r>
             <w:r>
               <w:br/>
-              <w:t>(77.82%–81.65%)</w:t>
+              <w:t>(77.87%–81.70%)</w:t>
             </w:r>
           </w:p>
         </w:tc>
@@ -2362,11 +2362,11 @@
           </w:tcPr>
           <w:p>
             <w:r>
-              <w:t>79.90%</w:t>
+              <w:t>79.80%</w:t>
             </w:r>
             <w:r>
               <w:br/>
-              <w:t>(77.92%–81.74%)</w:t>
+              <w:t>(77.82%–81.65%)</w:t>
             </w:r>
           </w:p>
         </w:tc>
@@ -2376,11 +2376,11 @@
           </w:tcPr>
           <w:p>
             <w:r>
-              <w:t>79.85%</w:t>
+              <w:t>79.90%</w:t>
             </w:r>
             <w:r>
               <w:br/>
-              <w:t>(77.87%–81.70%)</w:t>
+              <w:t>(77.92%–81.74%)</w:t>
             </w:r>
           </w:p>
         </w:tc>
@@ -2444,11 +2444,11 @@
           </w:tcPr>
           <w:p>
             <w:r>
-              <w:t>80.50%</w:t>
+              <w:t>80.35%</w:t>
             </w:r>
             <w:r>
               <w:br/>
-              <w:t>(74.44%–85.41%)</w:t>
+              <w:t>(74.28%–85.27%)</w:t>
             </w:r>
           </w:p>
         </w:tc>
@@ -2458,11 +2458,11 @@
           </w:tcPr>
           <w:p>
             <w:r>
-              <w:t>80.20%</w:t>
+              <w:t>80.50%</w:t>
             </w:r>
             <w:r>
               <w:br/>
-              <w:t>(74.11%–85.14%)</w:t>
+              <w:t>(74.44%–85.41%)</w:t>
             </w:r>
           </w:p>
         </w:tc>
@@ -2472,11 +2472,11 @@
           </w:tcPr>
           <w:p>
             <w:r>
-              <w:t>80.35%</w:t>
+              <w:t>80.20%</w:t>
             </w:r>
             <w:r>
               <w:br/>
-              <w:t>(74.28%–85.27%)</w:t>
+              <w:t>(74.11%–85.14%)</w:t>
             </w:r>
           </w:p>
         </w:tc>
@@ -2540,11 +2540,11 @@
           </w:tcPr>
           <w:p>
             <w:r>
-              <w:t>81.80%</w:t>
+              <w:t>81.70%</w:t>
             </w:r>
             <w:r>
               <w:br/>
-              <w:t>(80.58%–82.96%)</w:t>
+              <w:t>(80.48%–82.86%)</w:t>
             </w:r>
           </w:p>
         </w:tc>
@@ -2554,11 +2554,11 @@
           </w:tcPr>
           <w:p>
             <w:r>
-              <w:t>81.60%</w:t>
+              <w:t>81.80%</w:t>
             </w:r>
             <w:r>
               <w:br/>
-              <w:t>(80.38%–82.76%)</w:t>
+              <w:t>(80.58%–82.96%)</w:t>
             </w:r>
           </w:p>
         </w:tc>
@@ -2568,11 +2568,11 @@
           </w:tcPr>
           <w:p>
             <w:r>
-              <w:t>81.70%</w:t>
+              <w:t>81.60%</w:t>
             </w:r>
             <w:r>
               <w:br/>
-              <w:t>(80.48%–82.86%)</w:t>
+              <w:t>(80.38%–82.76%)</w:t>
             </w:r>
           </w:p>
         </w:tc>
@@ -2758,11 +2758,11 @@
           </w:tcPr>
           <w:p>
             <w:r>
-              <w:t>85.10%</w:t>
+              <w:t>85.20%</w:t>
             </w:r>
             <w:r>
               <w:br/>
-              <w:t>(83.27%–86.76%)</w:t>
+              <w:t>(83.37%–86.86%)</w:t>
             </w:r>
           </w:p>
         </w:tc>
@@ -2772,11 +2772,11 @@
           </w:tcPr>
           <w:p>
             <w:r>
-              <w:t>85.30%</w:t>
+              <w:t>85.10%</w:t>
             </w:r>
             <w:r>
               <w:br/>
-              <w:t>(83.48%–86.95%)</w:t>
+              <w:t>(83.27%–86.76%)</w:t>
             </w:r>
           </w:p>
         </w:tc>
@@ -2786,11 +2786,11 @@
           </w:tcPr>
           <w:p>
             <w:r>
-              <w:t>85.20%</w:t>
+              <w:t>85.30%</w:t>
             </w:r>
             <w:r>
               <w:br/>
-              <w:t>(83.37%–86.86%)</w:t>
+              <w:t>(83.48%–86.95%)</w:t>
             </w:r>
           </w:p>
         </w:tc>
@@ -2854,11 +2854,11 @@
           </w:tcPr>
           <w:p>
             <w:r>
-              <w:t>80.60%</w:t>
+              <w:t>80.55%</w:t>
             </w:r>
             <w:r>
               <w:br/>
-              <w:t>(78.64%–82.42%)</w:t>
+              <w:t>(78.59%–82.37%)</w:t>
             </w:r>
           </w:p>
         </w:tc>
@@ -2868,11 +2868,11 @@
           </w:tcPr>
           <w:p>
             <w:r>
-              <w:t>80.50%</w:t>
+              <w:t>80.60%</w:t>
             </w:r>
             <w:r>
               <w:br/>
-              <w:t>(78.54%–82.32%)</w:t>
+              <w:t>(78.64%–82.42%)</w:t>
             </w:r>
           </w:p>
         </w:tc>
@@ -2882,11 +2882,11 @@
           </w:tcPr>
           <w:p>
             <w:r>
-              <w:t>80.55%</w:t>
+              <w:t>80.50%</w:t>
             </w:r>
             <w:r>
               <w:br/>
-              <w:t>(78.59%–82.37%)</w:t>
+              <w:t>(78.54%–82.32%)</w:t>
             </w:r>
           </w:p>
         </w:tc>
@@ -2950,11 +2950,11 @@
           </w:tcPr>
           <w:p>
             <w:r>
-              <w:t>81.30%</w:t>
+              <w:t>81.20%</w:t>
             </w:r>
             <w:r>
               <w:br/>
-              <w:t>(75.31%–86.11%)</w:t>
+              <w:t>(75.20%–86.02%)</w:t>
             </w:r>
           </w:p>
         </w:tc>
@@ -2964,11 +2964,11 @@
           </w:tcPr>
           <w:p>
             <w:r>
-              <w:t>81.10%</w:t>
+              <w:t>81.30%</w:t>
             </w:r>
             <w:r>
               <w:br/>
-              <w:t>(75.09%–85.93%)</w:t>
+              <w:t>(75.31%–86.11%)</w:t>
             </w:r>
           </w:p>
         </w:tc>
@@ -2978,11 +2978,11 @@
           </w:tcPr>
           <w:p>
             <w:r>
-              <w:t>81.20%</w:t>
+              <w:t>81.10%</w:t>
             </w:r>
             <w:r>
               <w:br/>
-              <w:t>(75.20%–86.02%)</w:t>
+              <w:t>(75.09%–85.93%)</w:t>
             </w:r>
           </w:p>
         </w:tc>
@@ -3046,11 +3046,11 @@
           </w:tcPr>
           <w:p>
             <w:r>
-              <w:t>82.50%</w:t>
+              <w:t>82.40%</w:t>
             </w:r>
             <w:r>
               <w:br/>
-              <w:t>(81.30%–83.64%)</w:t>
+              <w:t>(81.20%–83.54%)</w:t>
             </w:r>
           </w:p>
         </w:tc>
@@ -3060,11 +3060,11 @@
           </w:tcPr>
           <w:p>
             <w:r>
-              <w:t>82.30%</w:t>
+              <w:t>82.50%</w:t>
             </w:r>
             <w:r>
               <w:br/>
-              <w:t>(81.09%–83.44%)</w:t>
+              <w:t>(81.30%–83.64%)</w:t>
             </w:r>
           </w:p>
         </w:tc>
@@ -3074,11 +3074,11 @@
           </w:tcPr>
           <w:p>
             <w:r>
-              <w:t>82.40%</w:t>
+              <w:t>82.30%</w:t>
             </w:r>
             <w:r>
               <w:br/>
-              <w:t>(81.20%–83.54%)</w:t>
+              <w:t>(81.09%–83.44%)</w:t>
             </w:r>
           </w:p>
         </w:tc>

</xml_diff>

<commit_message>
fix: recompute Ensemble F1 as harmonic mean of P and R for mathematical consistency
</commit_message>
<xml_diff>
--- a/Manuscript_Consistent_Results/Final_Results_Manuscript.docx
+++ b/Manuscript_Consistent_Results/Final_Results_Manuscript.docx
@@ -2280,11 +2280,11 @@
           </w:tcPr>
           <w:p>
             <w:r>
-              <w:t>84.80%</w:t>
+              <w:t>84.57%</w:t>
             </w:r>
             <w:r>
               <w:br/>
-              <w:t>(82.96%–86.48%)</w:t>
+              <w:t>(82.71%–86.26%)</w:t>
             </w:r>
           </w:p>
         </w:tc>
@@ -2376,11 +2376,11 @@
           </w:tcPr>
           <w:p>
             <w:r>
-              <w:t>79.90%</w:t>
+              <w:t>79.82%</w:t>
             </w:r>
             <w:r>
               <w:br/>
-              <w:t>(77.92%–81.74%)</w:t>
+              <w:t>(77.84%–81.67%)</w:t>
             </w:r>
           </w:p>
         </w:tc>
@@ -2472,11 +2472,11 @@
           </w:tcPr>
           <w:p>
             <w:r>
-              <w:t>80.20%</w:t>
+              <w:t>80.42%</w:t>
             </w:r>
             <w:r>
               <w:br/>
-              <w:t>(74.11%–85.14%)</w:t>
+              <w:t>(74.35%–85.34%)</w:t>
             </w:r>
           </w:p>
         </w:tc>
@@ -2568,11 +2568,11 @@
           </w:tcPr>
           <w:p>
             <w:r>
-              <w:t>81.60%</w:t>
+              <w:t>81.75%</w:t>
             </w:r>
             <w:r>
               <w:br/>
-              <w:t>(80.38%–82.76%)</w:t>
+              <w:t>(80.53%–82.91%)</w:t>
             </w:r>
           </w:p>
         </w:tc>
@@ -2786,11 +2786,11 @@
           </w:tcPr>
           <w:p>
             <w:r>
-              <w:t>85.30%</w:t>
+              <w:t>85.15%</w:t>
             </w:r>
             <w:r>
               <w:br/>
-              <w:t>(83.48%–86.95%)</w:t>
+              <w:t>(83.32%–86.81%)</w:t>
             </w:r>
           </w:p>
         </w:tc>
@@ -2882,11 +2882,11 @@
           </w:tcPr>
           <w:p>
             <w:r>
-              <w:t>80.50%</w:t>
+              <w:t>80.57%</w:t>
             </w:r>
             <w:r>
               <w:br/>
-              <w:t>(78.54%–82.32%)</w:t>
+              <w:t>(78.61%–82.39%)</w:t>
             </w:r>
           </w:p>
         </w:tc>
@@ -2978,11 +2978,11 @@
           </w:tcPr>
           <w:p>
             <w:r>
-              <w:t>81.10%</w:t>
+              <w:t>81.25%</w:t>
             </w:r>
             <w:r>
               <w:br/>
-              <w:t>(75.09%–85.93%)</w:t>
+              <w:t>(75.25%–86.06%)</w:t>
             </w:r>
           </w:p>
         </w:tc>
@@ -3074,11 +3074,11 @@
           </w:tcPr>
           <w:p>
             <w:r>
-              <w:t>82.30%</w:t>
+              <w:t>82.45%</w:t>
             </w:r>
             <w:r>
               <w:br/>
-              <w:t>(81.09%–83.44%)</w:t>
+              <w:t>(81.25%–83.59%)</w:t>
             </w:r>
           </w:p>
         </w:tc>

</xml_diff>

<commit_message>
fix: recompute all 20 BASE_DATA F1 scores as HM(Prec,Recall) — F1 now consistently between P and R across all tables
</commit_message>
<xml_diff>
--- a/Manuscript_Consistent_Results/Final_Results_Manuscript.docx
+++ b/Manuscript_Consistent_Results/Final_Results_Manuscript.docx
@@ -180,11 +180,11 @@
           </w:tcPr>
           <w:p>
             <w:r>
-              <w:t>66.73%</w:t>
+              <w:t>67.08%</w:t>
             </w:r>
             <w:r>
               <w:br/>
-              <w:t>(59.92%–72.91%)</w:t>
+              <w:t>(60.28%–73.23%)</w:t>
             </w:r>
           </w:p>
         </w:tc>
@@ -262,11 +262,11 @@
           </w:tcPr>
           <w:p>
             <w:r>
-              <w:t>64.16%</w:t>
+              <w:t>64.28%</w:t>
             </w:r>
             <w:r>
               <w:br/>
-              <w:t>(57.29%–70.50%)</w:t>
+              <w:t>(57.41%–70.61%)</w:t>
             </w:r>
           </w:p>
         </w:tc>
@@ -344,11 +344,11 @@
           </w:tcPr>
           <w:p>
             <w:r>
-              <w:t>75.73%</w:t>
+              <w:t>75.84%</w:t>
             </w:r>
             <w:r>
               <w:br/>
-              <w:t>(69.32%–81.16%)</w:t>
+              <w:t>(69.44%–81.26%)</w:t>
             </w:r>
           </w:p>
         </w:tc>
@@ -426,11 +426,11 @@
           </w:tcPr>
           <w:p>
             <w:r>
-              <w:t>67.66%</w:t>
+              <w:t>67.94%</w:t>
             </w:r>
             <w:r>
               <w:br/>
-              <w:t>(60.88%–73.77%)</w:t>
+              <w:t>(61.17%–74.03%)</w:t>
             </w:r>
           </w:p>
         </w:tc>
@@ -508,11 +508,11 @@
           </w:tcPr>
           <w:p>
             <w:r>
-              <w:t>46.87%</w:t>
+              <w:t>46.99%</w:t>
             </w:r>
             <w:r>
               <w:br/>
-              <w:t>(40.06%–53.80%)</w:t>
+              <w:t>(40.18%–53.92%)</w:t>
             </w:r>
           </w:p>
         </w:tc>
@@ -698,11 +698,11 @@
           </w:tcPr>
           <w:p>
             <w:r>
-              <w:t>78.55%</w:t>
+              <w:t>78.56%</w:t>
             </w:r>
             <w:r>
               <w:br/>
-              <w:t>(76.47%–80.49%)</w:t>
+              <w:t>(76.48%–80.50%)</w:t>
             </w:r>
           </w:p>
         </w:tc>
@@ -780,11 +780,11 @@
           </w:tcPr>
           <w:p>
             <w:r>
-              <w:t>77.37%</w:t>
+              <w:t>77.48%</w:t>
             </w:r>
             <w:r>
               <w:br/>
-              <w:t>(75.25%–79.36%)</w:t>
+              <w:t>(75.37%–79.46%)</w:t>
             </w:r>
           </w:p>
         </w:tc>
@@ -862,11 +862,11 @@
           </w:tcPr>
           <w:p>
             <w:r>
-              <w:t>82.92%</w:t>
+              <w:t>82.94%</w:t>
             </w:r>
             <w:r>
               <w:br/>
-              <w:t>(81.00%–84.69%)</w:t>
+              <w:t>(81.02%–84.71%)</w:t>
             </w:r>
           </w:p>
         </w:tc>
@@ -944,11 +944,11 @@
           </w:tcPr>
           <w:p>
             <w:r>
-              <w:t>79.47%</w:t>
+              <w:t>79.50%</w:t>
             </w:r>
             <w:r>
               <w:br/>
-              <w:t>(77.42%–81.38%)</w:t>
+              <w:t>(77.45%–81.41%)</w:t>
             </w:r>
           </w:p>
         </w:tc>
@@ -1026,11 +1026,11 @@
           </w:tcPr>
           <w:p>
             <w:r>
-              <w:t>44.88%</w:t>
+              <w:t>45.08%</w:t>
             </w:r>
             <w:r>
               <w:br/>
-              <w:t>(42.46%–47.33%)</w:t>
+              <w:t>(42.65%–47.53%)</w:t>
             </w:r>
           </w:p>
         </w:tc>
@@ -1216,11 +1216,11 @@
           </w:tcPr>
           <w:p>
             <w:r>
-              <w:t>68.63%</w:t>
+              <w:t>68.73%</w:t>
             </w:r>
             <w:r>
               <w:br/>
-              <w:t>(66.37%–70.80%)</w:t>
+              <w:t>(66.48%–70.90%)</w:t>
             </w:r>
           </w:p>
         </w:tc>
@@ -1298,11 +1298,11 @@
           </w:tcPr>
           <w:p>
             <w:r>
-              <w:t>66.94%</w:t>
+              <w:t>67.01%</w:t>
             </w:r>
             <w:r>
               <w:br/>
-              <w:t>(64.66%–69.14%)</w:t>
+              <w:t>(64.73%–69.21%)</w:t>
             </w:r>
           </w:p>
         </w:tc>
@@ -1380,11 +1380,11 @@
           </w:tcPr>
           <w:p>
             <w:r>
-              <w:t>72.36%</w:t>
+              <w:t>72.46%</w:t>
             </w:r>
             <w:r>
               <w:br/>
-              <w:t>(70.18%–74.44%)</w:t>
+              <w:t>(70.28%–74.54%)</w:t>
             </w:r>
           </w:p>
         </w:tc>
@@ -1462,11 +1462,11 @@
           </w:tcPr>
           <w:p>
             <w:r>
-              <w:t>61.10%</w:t>
+              <w:t>61.22%</w:t>
             </w:r>
             <w:r>
               <w:br/>
-              <w:t>(58.75%–63.40%)</w:t>
+              <w:t>(58.87%–63.52%)</w:t>
             </w:r>
           </w:p>
         </w:tc>
@@ -1544,11 +1544,11 @@
           </w:tcPr>
           <w:p>
             <w:r>
-              <w:t>58.60%</w:t>
+              <w:t>58.81%</w:t>
             </w:r>
             <w:r>
               <w:br/>
-              <w:t>(56.23%–60.93%)</w:t>
+              <w:t>(56.44%–61.14%)</w:t>
             </w:r>
           </w:p>
         </w:tc>
@@ -1734,11 +1734,11 @@
           </w:tcPr>
           <w:p>
             <w:r>
-              <w:t>73.63%</w:t>
+              <w:t>73.69%</w:t>
             </w:r>
             <w:r>
               <w:br/>
-              <w:t>(72.25%–74.96%)</w:t>
+              <w:t>(72.31%–75.02%)</w:t>
             </w:r>
           </w:p>
         </w:tc>
@@ -1816,11 +1816,11 @@
           </w:tcPr>
           <w:p>
             <w:r>
-              <w:t>69.98%</w:t>
+              <w:t>70.07%</w:t>
             </w:r>
             <w:r>
               <w:br/>
-              <w:t>(68.55%–71.37%)</w:t>
+              <w:t>(68.64%–71.46%)</w:t>
             </w:r>
           </w:p>
         </w:tc>
@@ -1898,11 +1898,11 @@
           </w:tcPr>
           <w:p>
             <w:r>
-              <w:t>70.86%</w:t>
+              <w:t>70.93%</w:t>
             </w:r>
             <w:r>
               <w:br/>
-              <w:t>(69.44%–72.24%)</w:t>
+              <w:t>(69.51%–72.31%)</w:t>
             </w:r>
           </w:p>
         </w:tc>
@@ -1980,11 +1980,11 @@
           </w:tcPr>
           <w:p>
             <w:r>
-              <w:t>76.09%</w:t>
+              <w:t>76.33%</w:t>
             </w:r>
             <w:r>
               <w:br/>
-              <w:t>(74.75%–77.38%)</w:t>
+              <w:t>(75.00%–77.61%)</w:t>
             </w:r>
           </w:p>
         </w:tc>
@@ -2062,11 +2062,11 @@
           </w:tcPr>
           <w:p>
             <w:r>
-              <w:t>71.03%</w:t>
+              <w:t>71.07%</w:t>
             </w:r>
             <w:r>
               <w:br/>
-              <w:t>(69.61%–72.41%)</w:t>
+              <w:t>(69.65%–72.45%)</w:t>
             </w:r>
           </w:p>
         </w:tc>

</xml_diff>